<commit_message>
Change title in pages and file .docx
</commit_message>
<xml_diff>
--- a/ice21390298_ice22390241_ice22390311_report.docx
+++ b/ice21390298_ice22390241_ice22390311_report.docx
@@ -274,7 +274,6 @@
         <w:rPr>
           <w:b/>
           <w:sz w:val="28"/>
-          <w:lang w:val="en-US"/>
         </w:rPr>
       </w:pPr>
       <w:r>
@@ -309,7 +308,6 @@
         <w:jc w:val="center"/>
         <w:rPr>
           <w:b/>
-          <w:lang w:val="en-US"/>
         </w:rPr>
       </w:pPr>
       <w:r>
@@ -321,7 +319,6 @@
       <w:r>
         <w:rPr>
           <w:b/>
-          <w:lang w:val="en-US"/>
         </w:rPr>
         <w:t>5</w:t>
       </w:r>
@@ -334,7 +331,6 @@
       <w:r>
         <w:rPr>
           <w:b/>
-          <w:lang w:val="en-US"/>
         </w:rPr>
         <w:t>6</w:t>
       </w:r>
@@ -369,7 +365,6 @@
           <w:b/>
           <w:sz w:val="22"/>
           <w:szCs w:val="22"/>
-          <w:lang w:val="en-US"/>
         </w:rPr>
       </w:pPr>
       <w:r>
@@ -439,7 +434,6 @@
         <w:jc w:val="center"/>
         <w:rPr>
           <w:b/>
-          <w:lang w:val="en-US"/>
         </w:rPr>
       </w:pPr>
       <w:r>
@@ -463,7 +457,6 @@
         <w:jc w:val="center"/>
         <w:rPr>
           <w:b/>
-          <w:lang w:val="en-US"/>
         </w:rPr>
       </w:pPr>
       <w:r>
@@ -488,7 +481,6 @@
         <w:jc w:val="center"/>
         <w:rPr>
           <w:b/>
-          <w:lang w:val="en-US"/>
         </w:rPr>
       </w:pPr>
       <w:r>
@@ -512,7 +504,6 @@
         <w:jc w:val="center"/>
         <w:rPr>
           <w:b/>
-          <w:lang w:val="en-US"/>
         </w:rPr>
       </w:pPr>
       <w:r>
@@ -917,7 +908,7 @@
           <w:r>
             <w:fldChar w:fldCharType="separate"/>
           </w:r>
-          <w:hyperlink w:anchor="_Toc231928201" w:history="1">
+          <w:hyperlink w:anchor="_Toc232015389" w:history="1">
             <w:r>
               <w:rPr>
                 <w:rStyle w:val="-"/>
@@ -944,7 +935,7 @@
                 <w:noProof/>
                 <w:webHidden/>
               </w:rPr>
-              <w:instrText xml:space="preserve"> PAGEREF _Toc231928201 \h </w:instrText>
+              <w:instrText xml:space="preserve"> PAGEREF _Toc232015389 \h </w:instrText>
             </w:r>
             <w:r>
               <w:rPr>
@@ -990,7 +981,7 @@
               <w14:ligatures w14:val="standardContextual"/>
             </w:rPr>
           </w:pPr>
-          <w:hyperlink w:anchor="_Toc231928202" w:history="1">
+          <w:hyperlink w:anchor="_Toc232015390" w:history="1">
             <w:r>
               <w:rPr>
                 <w:rStyle w:val="-"/>
@@ -1017,7 +1008,7 @@
                 <w:noProof/>
                 <w:webHidden/>
               </w:rPr>
-              <w:instrText xml:space="preserve"> PAGEREF _Toc231928202 \h </w:instrText>
+              <w:instrText xml:space="preserve"> PAGEREF _Toc232015390 \h </w:instrText>
             </w:r>
             <w:r>
               <w:rPr>
@@ -1063,7 +1054,7 @@
               <w14:ligatures w14:val="standardContextual"/>
             </w:rPr>
           </w:pPr>
-          <w:hyperlink w:anchor="_Toc231928203" w:history="1">
+          <w:hyperlink w:anchor="_Toc232015391" w:history="1">
             <w:r>
               <w:rPr>
                 <w:rStyle w:val="-"/>
@@ -1090,7 +1081,7 @@
                 <w:noProof/>
                 <w:webHidden/>
               </w:rPr>
-              <w:instrText xml:space="preserve"> PAGEREF _Toc231928203 \h </w:instrText>
+              <w:instrText xml:space="preserve"> PAGEREF _Toc232015391 \h </w:instrText>
             </w:r>
             <w:r>
               <w:rPr>
@@ -1136,51 +1127,13 @@
               <w14:ligatures w14:val="standardContextual"/>
             </w:rPr>
           </w:pPr>
-          <w:hyperlink w:anchor="_Toc231928204" w:history="1">
+          <w:hyperlink w:anchor="_Toc232015392" w:history="1">
             <w:r>
               <w:rPr>
                 <w:rStyle w:val="-"/>
                 <w:noProof/>
-                <w:lang w:val="en-US"/>
-              </w:rPr>
-              <w:t>1</w:t>
-            </w:r>
-            <w:r>
-              <w:rPr>
-                <w:rStyle w:val="-"/>
-                <w:noProof/>
-              </w:rPr>
-              <w:t>.</w:t>
-            </w:r>
-            <w:r>
-              <w:rPr>
-                <w:rStyle w:val="-"/>
-                <w:noProof/>
-                <w:lang w:val="en-US"/>
-              </w:rPr>
-              <w:t xml:space="preserve"> 3</w:t>
-            </w:r>
-            <w:r>
-              <w:rPr>
-                <w:rStyle w:val="-"/>
-                <w:noProof/>
-              </w:rPr>
-              <w:t>.</w:t>
-            </w:r>
-            <w:r>
-              <w:rPr>
-                <w:rStyle w:val="-"/>
-                <w:noProof/>
-                <w:lang w:val="en-US"/>
-              </w:rPr>
-              <w:t xml:space="preserve"> </w:t>
-            </w:r>
-            <w:r>
-              <w:rPr>
-                <w:rStyle w:val="-"/>
-                <w:noProof/>
-              </w:rPr>
-              <w:t>Τεχνολογικό Υπόβαθρο Εφαρμογής</w:t>
+              </w:rPr>
+              <w:t>1. 3. Τεχνολογικό Υπόβαθρο Εφαρμογής</w:t>
             </w:r>
             <w:r>
               <w:rPr>
@@ -1201,7 +1154,7 @@
                 <w:noProof/>
                 <w:webHidden/>
               </w:rPr>
-              <w:instrText xml:space="preserve"> PAGEREF _Toc231928204 \h </w:instrText>
+              <w:instrText xml:space="preserve"> PAGEREF _Toc232015392 \h </w:instrText>
             </w:r>
             <w:r>
               <w:rPr>
@@ -1247,7 +1200,7 @@
               <w14:ligatures w14:val="standardContextual"/>
             </w:rPr>
           </w:pPr>
-          <w:hyperlink w:anchor="_Toc231928205" w:history="1">
+          <w:hyperlink w:anchor="_Toc232015393" w:history="1">
             <w:r>
               <w:rPr>
                 <w:rStyle w:val="-"/>
@@ -1274,7 +1227,7 @@
                 <w:noProof/>
                 <w:webHidden/>
               </w:rPr>
-              <w:instrText xml:space="preserve"> PAGEREF _Toc231928205 \h </w:instrText>
+              <w:instrText xml:space="preserve"> PAGEREF _Toc232015393 \h </w:instrText>
             </w:r>
             <w:r>
               <w:rPr>
@@ -1320,7 +1273,7 @@
               <w14:ligatures w14:val="standardContextual"/>
             </w:rPr>
           </w:pPr>
-          <w:hyperlink w:anchor="_Toc231928206" w:history="1">
+          <w:hyperlink w:anchor="_Toc232015394" w:history="1">
             <w:r>
               <w:rPr>
                 <w:rStyle w:val="-"/>
@@ -1347,7 +1300,7 @@
                 <w:noProof/>
                 <w:webHidden/>
               </w:rPr>
-              <w:instrText xml:space="preserve"> PAGEREF _Toc231928206 \h </w:instrText>
+              <w:instrText xml:space="preserve"> PAGEREF _Toc232015394 \h </w:instrText>
             </w:r>
             <w:r>
               <w:rPr>
@@ -1386,9 +1339,14 @@
             </w:tabs>
             <w:rPr>
               <w:noProof/>
+              <w:kern w:val="2"/>
+              <w:sz w:val="24"/>
+              <w:szCs w:val="24"/>
+              <w:lang w:eastAsia="el-GR"/>
+              <w14:ligatures w14:val="standardContextual"/>
             </w:rPr>
           </w:pPr>
-          <w:hyperlink w:anchor="_Toc231928207" w:history="1">
+          <w:hyperlink w:anchor="_Toc232015395" w:history="1">
             <w:r>
               <w:rPr>
                 <w:rStyle w:val="-"/>
@@ -1415,7 +1373,7 @@
                 <w:noProof/>
                 <w:webHidden/>
               </w:rPr>
-              <w:instrText xml:space="preserve"> PAGEREF _Toc231928207 \h </w:instrText>
+              <w:instrText xml:space="preserve"> PAGEREF _Toc232015395 \h </w:instrText>
             </w:r>
             <w:r>
               <w:rPr>
@@ -1454,9 +1412,14 @@
             </w:tabs>
             <w:rPr>
               <w:noProof/>
+              <w:kern w:val="2"/>
+              <w:sz w:val="24"/>
+              <w:szCs w:val="24"/>
+              <w:lang w:eastAsia="el-GR"/>
+              <w14:ligatures w14:val="standardContextual"/>
             </w:rPr>
           </w:pPr>
-          <w:hyperlink w:anchor="_Toc231928208" w:history="1">
+          <w:hyperlink w:anchor="_Toc232015396" w:history="1">
             <w:r>
               <w:rPr>
                 <w:rStyle w:val="-"/>
@@ -1498,7 +1461,7 @@
                 <w:noProof/>
                 <w:webHidden/>
               </w:rPr>
-              <w:instrText xml:space="preserve"> PAGEREF _Toc231928208 \h </w:instrText>
+              <w:instrText xml:space="preserve"> PAGEREF _Toc232015396 \h </w:instrText>
             </w:r>
             <w:r>
               <w:rPr>
@@ -1537,9 +1500,14 @@
             </w:tabs>
             <w:rPr>
               <w:noProof/>
+              <w:kern w:val="2"/>
+              <w:sz w:val="24"/>
+              <w:szCs w:val="24"/>
+              <w:lang w:eastAsia="el-GR"/>
+              <w14:ligatures w14:val="standardContextual"/>
             </w:rPr>
           </w:pPr>
-          <w:hyperlink w:anchor="_Toc231928209" w:history="1">
+          <w:hyperlink w:anchor="_Toc232015397" w:history="1">
             <w:r>
               <w:rPr>
                 <w:rStyle w:val="-"/>
@@ -1566,7 +1534,7 @@
                 <w:noProof/>
                 <w:webHidden/>
               </w:rPr>
-              <w:instrText xml:space="preserve"> PAGEREF _Toc231928209 \h </w:instrText>
+              <w:instrText xml:space="preserve"> PAGEREF _Toc232015397 \h </w:instrText>
             </w:r>
             <w:r>
               <w:rPr>
@@ -1605,9 +1573,14 @@
             </w:tabs>
             <w:rPr>
               <w:noProof/>
+              <w:kern w:val="2"/>
+              <w:sz w:val="24"/>
+              <w:szCs w:val="24"/>
+              <w:lang w:eastAsia="el-GR"/>
+              <w14:ligatures w14:val="standardContextual"/>
             </w:rPr>
           </w:pPr>
-          <w:hyperlink w:anchor="_Toc231928210" w:history="1">
+          <w:hyperlink w:anchor="_Toc232015398" w:history="1">
             <w:r>
               <w:rPr>
                 <w:rStyle w:val="-"/>
@@ -1634,7 +1607,7 @@
                 <w:noProof/>
                 <w:webHidden/>
               </w:rPr>
-              <w:instrText xml:space="preserve"> PAGEREF _Toc231928210 \h </w:instrText>
+              <w:instrText xml:space="preserve"> PAGEREF _Toc232015398 \h </w:instrText>
             </w:r>
             <w:r>
               <w:rPr>
@@ -1673,9 +1646,14 @@
             </w:tabs>
             <w:rPr>
               <w:noProof/>
+              <w:kern w:val="2"/>
+              <w:sz w:val="24"/>
+              <w:szCs w:val="24"/>
+              <w:lang w:eastAsia="el-GR"/>
+              <w14:ligatures w14:val="standardContextual"/>
             </w:rPr>
           </w:pPr>
-          <w:hyperlink w:anchor="_Toc231928211" w:history="1">
+          <w:hyperlink w:anchor="_Toc232015399" w:history="1">
             <w:r>
               <w:rPr>
                 <w:rStyle w:val="-"/>
@@ -1717,7 +1695,7 @@
                 <w:noProof/>
                 <w:webHidden/>
               </w:rPr>
-              <w:instrText xml:space="preserve"> PAGEREF _Toc231928211 \h </w:instrText>
+              <w:instrText xml:space="preserve"> PAGEREF _Toc232015399 \h </w:instrText>
             </w:r>
             <w:r>
               <w:rPr>
@@ -1738,6 +1716,444 @@
                 <w:webHidden/>
               </w:rPr>
               <w:t>8</w:t>
+            </w:r>
+            <w:r>
+              <w:rPr>
+                <w:noProof/>
+                <w:webHidden/>
+              </w:rPr>
+              <w:fldChar w:fldCharType="end"/>
+            </w:r>
+          </w:hyperlink>
+        </w:p>
+        <w:p>
+          <w:pPr>
+            <w:pStyle w:val="20"/>
+            <w:tabs>
+              <w:tab w:val="right" w:leader="dot" w:pos="9628"/>
+            </w:tabs>
+            <w:rPr>
+              <w:noProof/>
+              <w:kern w:val="2"/>
+              <w:sz w:val="24"/>
+              <w:szCs w:val="24"/>
+              <w:lang w:eastAsia="el-GR"/>
+              <w14:ligatures w14:val="standardContextual"/>
+            </w:rPr>
+          </w:pPr>
+          <w:hyperlink w:anchor="_Toc232015400" w:history="1">
+            <w:r>
+              <w:rPr>
+                <w:rStyle w:val="-"/>
+                <w:noProof/>
+              </w:rPr>
+              <w:t>2. 2. Λειτουργίες Καθηγητή</w:t>
+            </w:r>
+            <w:r>
+              <w:rPr>
+                <w:noProof/>
+                <w:webHidden/>
+              </w:rPr>
+              <w:tab/>
+            </w:r>
+            <w:r>
+              <w:rPr>
+                <w:noProof/>
+                <w:webHidden/>
+              </w:rPr>
+              <w:fldChar w:fldCharType="begin"/>
+            </w:r>
+            <w:r>
+              <w:rPr>
+                <w:noProof/>
+                <w:webHidden/>
+              </w:rPr>
+              <w:instrText xml:space="preserve"> PAGEREF _Toc232015400 \h </w:instrText>
+            </w:r>
+            <w:r>
+              <w:rPr>
+                <w:noProof/>
+                <w:webHidden/>
+              </w:rPr>
+            </w:r>
+            <w:r>
+              <w:rPr>
+                <w:noProof/>
+                <w:webHidden/>
+              </w:rPr>
+              <w:fldChar w:fldCharType="separate"/>
+            </w:r>
+            <w:r>
+              <w:rPr>
+                <w:noProof/>
+                <w:webHidden/>
+              </w:rPr>
+              <w:t>10</w:t>
+            </w:r>
+            <w:r>
+              <w:rPr>
+                <w:noProof/>
+                <w:webHidden/>
+              </w:rPr>
+              <w:fldChar w:fldCharType="end"/>
+            </w:r>
+          </w:hyperlink>
+        </w:p>
+        <w:p>
+          <w:pPr>
+            <w:pStyle w:val="30"/>
+            <w:tabs>
+              <w:tab w:val="right" w:leader="dot" w:pos="9628"/>
+            </w:tabs>
+            <w:rPr>
+              <w:noProof/>
+              <w:kern w:val="2"/>
+              <w:sz w:val="24"/>
+              <w:szCs w:val="24"/>
+              <w:lang w:eastAsia="el-GR"/>
+              <w14:ligatures w14:val="standardContextual"/>
+            </w:rPr>
+          </w:pPr>
+          <w:hyperlink w:anchor="_Toc232015401" w:history="1">
+            <w:r>
+              <w:rPr>
+                <w:rStyle w:val="-"/>
+                <w:noProof/>
+              </w:rPr>
+              <w:t>2. 2. 1. Είσοδος καθηγητή στην Εφαρμογή</w:t>
+            </w:r>
+            <w:r>
+              <w:rPr>
+                <w:noProof/>
+                <w:webHidden/>
+              </w:rPr>
+              <w:tab/>
+            </w:r>
+            <w:r>
+              <w:rPr>
+                <w:noProof/>
+                <w:webHidden/>
+              </w:rPr>
+              <w:fldChar w:fldCharType="begin"/>
+            </w:r>
+            <w:r>
+              <w:rPr>
+                <w:noProof/>
+                <w:webHidden/>
+              </w:rPr>
+              <w:instrText xml:space="preserve"> PAGEREF _Toc232015401 \h </w:instrText>
+            </w:r>
+            <w:r>
+              <w:rPr>
+                <w:noProof/>
+                <w:webHidden/>
+              </w:rPr>
+            </w:r>
+            <w:r>
+              <w:rPr>
+                <w:noProof/>
+                <w:webHidden/>
+              </w:rPr>
+              <w:fldChar w:fldCharType="separate"/>
+            </w:r>
+            <w:r>
+              <w:rPr>
+                <w:noProof/>
+                <w:webHidden/>
+              </w:rPr>
+              <w:t>10</w:t>
+            </w:r>
+            <w:r>
+              <w:rPr>
+                <w:noProof/>
+                <w:webHidden/>
+              </w:rPr>
+              <w:fldChar w:fldCharType="end"/>
+            </w:r>
+          </w:hyperlink>
+        </w:p>
+        <w:p>
+          <w:pPr>
+            <w:pStyle w:val="30"/>
+            <w:tabs>
+              <w:tab w:val="right" w:leader="dot" w:pos="9628"/>
+            </w:tabs>
+            <w:rPr>
+              <w:noProof/>
+              <w:kern w:val="2"/>
+              <w:sz w:val="24"/>
+              <w:szCs w:val="24"/>
+              <w:lang w:eastAsia="el-GR"/>
+              <w14:ligatures w14:val="standardContextual"/>
+            </w:rPr>
+          </w:pPr>
+          <w:hyperlink w:anchor="_Toc232015402" w:history="1">
+            <w:r>
+              <w:rPr>
+                <w:rStyle w:val="-"/>
+                <w:noProof/>
+              </w:rPr>
+              <w:t>2. 2. 2. Δημιουργία και Επεξεργασία Καθηγητή</w:t>
+            </w:r>
+            <w:r>
+              <w:rPr>
+                <w:noProof/>
+                <w:webHidden/>
+              </w:rPr>
+              <w:tab/>
+            </w:r>
+            <w:r>
+              <w:rPr>
+                <w:noProof/>
+                <w:webHidden/>
+              </w:rPr>
+              <w:fldChar w:fldCharType="begin"/>
+            </w:r>
+            <w:r>
+              <w:rPr>
+                <w:noProof/>
+                <w:webHidden/>
+              </w:rPr>
+              <w:instrText xml:space="preserve"> PAGEREF _Toc232015402 \h </w:instrText>
+            </w:r>
+            <w:r>
+              <w:rPr>
+                <w:noProof/>
+                <w:webHidden/>
+              </w:rPr>
+            </w:r>
+            <w:r>
+              <w:rPr>
+                <w:noProof/>
+                <w:webHidden/>
+              </w:rPr>
+              <w:fldChar w:fldCharType="separate"/>
+            </w:r>
+            <w:r>
+              <w:rPr>
+                <w:noProof/>
+                <w:webHidden/>
+              </w:rPr>
+              <w:t>11</w:t>
+            </w:r>
+            <w:r>
+              <w:rPr>
+                <w:noProof/>
+                <w:webHidden/>
+              </w:rPr>
+              <w:fldChar w:fldCharType="end"/>
+            </w:r>
+          </w:hyperlink>
+        </w:p>
+        <w:p>
+          <w:pPr>
+            <w:pStyle w:val="30"/>
+            <w:tabs>
+              <w:tab w:val="right" w:leader="dot" w:pos="9628"/>
+            </w:tabs>
+            <w:rPr>
+              <w:noProof/>
+              <w:kern w:val="2"/>
+              <w:sz w:val="24"/>
+              <w:szCs w:val="24"/>
+              <w:lang w:eastAsia="el-GR"/>
+              <w14:ligatures w14:val="standardContextual"/>
+            </w:rPr>
+          </w:pPr>
+          <w:hyperlink w:anchor="_Toc232015403" w:history="1">
+            <w:r>
+              <w:rPr>
+                <w:rStyle w:val="-"/>
+                <w:noProof/>
+              </w:rPr>
+              <w:t>2. 2. 3. Δημιουργία και Επεξεργασία Μαθητή</w:t>
+            </w:r>
+            <w:r>
+              <w:rPr>
+                <w:noProof/>
+                <w:webHidden/>
+              </w:rPr>
+              <w:tab/>
+            </w:r>
+            <w:r>
+              <w:rPr>
+                <w:noProof/>
+                <w:webHidden/>
+              </w:rPr>
+              <w:fldChar w:fldCharType="begin"/>
+            </w:r>
+            <w:r>
+              <w:rPr>
+                <w:noProof/>
+                <w:webHidden/>
+              </w:rPr>
+              <w:instrText xml:space="preserve"> PAGEREF _Toc232015403 \h </w:instrText>
+            </w:r>
+            <w:r>
+              <w:rPr>
+                <w:noProof/>
+                <w:webHidden/>
+              </w:rPr>
+            </w:r>
+            <w:r>
+              <w:rPr>
+                <w:noProof/>
+                <w:webHidden/>
+              </w:rPr>
+              <w:fldChar w:fldCharType="separate"/>
+            </w:r>
+            <w:r>
+              <w:rPr>
+                <w:noProof/>
+                <w:webHidden/>
+              </w:rPr>
+              <w:t>12</w:t>
+            </w:r>
+            <w:r>
+              <w:rPr>
+                <w:noProof/>
+                <w:webHidden/>
+              </w:rPr>
+              <w:fldChar w:fldCharType="end"/>
+            </w:r>
+          </w:hyperlink>
+        </w:p>
+        <w:p>
+          <w:pPr>
+            <w:pStyle w:val="30"/>
+            <w:tabs>
+              <w:tab w:val="right" w:leader="dot" w:pos="9628"/>
+            </w:tabs>
+            <w:rPr>
+              <w:noProof/>
+              <w:kern w:val="2"/>
+              <w:sz w:val="24"/>
+              <w:szCs w:val="24"/>
+              <w:lang w:eastAsia="el-GR"/>
+              <w14:ligatures w14:val="standardContextual"/>
+            </w:rPr>
+          </w:pPr>
+          <w:hyperlink w:anchor="_Toc232015404" w:history="1">
+            <w:r>
+              <w:rPr>
+                <w:rStyle w:val="-"/>
+                <w:noProof/>
+              </w:rPr>
+              <w:t>2. 2. 4. Δημιουργία και Επεξεργασία Ενότητας</w:t>
+            </w:r>
+            <w:r>
+              <w:rPr>
+                <w:noProof/>
+                <w:webHidden/>
+              </w:rPr>
+              <w:tab/>
+            </w:r>
+            <w:r>
+              <w:rPr>
+                <w:noProof/>
+                <w:webHidden/>
+              </w:rPr>
+              <w:fldChar w:fldCharType="begin"/>
+            </w:r>
+            <w:r>
+              <w:rPr>
+                <w:noProof/>
+                <w:webHidden/>
+              </w:rPr>
+              <w:instrText xml:space="preserve"> PAGEREF _Toc232015404 \h </w:instrText>
+            </w:r>
+            <w:r>
+              <w:rPr>
+                <w:noProof/>
+                <w:webHidden/>
+              </w:rPr>
+            </w:r>
+            <w:r>
+              <w:rPr>
+                <w:noProof/>
+                <w:webHidden/>
+              </w:rPr>
+              <w:fldChar w:fldCharType="separate"/>
+            </w:r>
+            <w:r>
+              <w:rPr>
+                <w:noProof/>
+                <w:webHidden/>
+              </w:rPr>
+              <w:t>14</w:t>
+            </w:r>
+            <w:r>
+              <w:rPr>
+                <w:noProof/>
+                <w:webHidden/>
+              </w:rPr>
+              <w:fldChar w:fldCharType="end"/>
+            </w:r>
+          </w:hyperlink>
+        </w:p>
+        <w:p>
+          <w:pPr>
+            <w:pStyle w:val="30"/>
+            <w:tabs>
+              <w:tab w:val="right" w:leader="dot" w:pos="9628"/>
+            </w:tabs>
+            <w:rPr>
+              <w:noProof/>
+              <w:kern w:val="2"/>
+              <w:sz w:val="24"/>
+              <w:szCs w:val="24"/>
+              <w:lang w:eastAsia="el-GR"/>
+              <w14:ligatures w14:val="standardContextual"/>
+            </w:rPr>
+          </w:pPr>
+          <w:hyperlink w:anchor="_Toc232015405" w:history="1">
+            <w:r>
+              <w:rPr>
+                <w:rStyle w:val="-"/>
+                <w:noProof/>
+              </w:rPr>
+              <w:t>2. 2. 5. Δημιουργία και Επεξεργασία Μαθημάτων</w:t>
+            </w:r>
+            <w:r>
+              <w:rPr>
+                <w:noProof/>
+                <w:webHidden/>
+              </w:rPr>
+              <w:tab/>
+            </w:r>
+            <w:r>
+              <w:rPr>
+                <w:noProof/>
+                <w:webHidden/>
+              </w:rPr>
+              <w:fldChar w:fldCharType="begin"/>
+            </w:r>
+            <w:r>
+              <w:rPr>
+                <w:noProof/>
+                <w:webHidden/>
+              </w:rPr>
+              <w:instrText xml:space="preserve"> PAGEREF _Toc232015405 \h </w:instrText>
+            </w:r>
+            <w:r>
+              <w:rPr>
+                <w:noProof/>
+                <w:webHidden/>
+              </w:rPr>
+            </w:r>
+            <w:r>
+              <w:rPr>
+                <w:noProof/>
+                <w:webHidden/>
+              </w:rPr>
+              <w:fldChar w:fldCharType="separate"/>
+            </w:r>
+            <w:r>
+              <w:rPr>
+                <w:noProof/>
+                <w:webHidden/>
+              </w:rPr>
+              <w:t>15</w:t>
             </w:r>
             <w:r>
               <w:rPr>
@@ -1931,109 +2347,9 @@
     </w:p>
     <w:p>
       <w:pPr>
-        <w:spacing w:after="0" w:line="240" w:lineRule="auto"/>
-        <w:contextualSpacing/>
-      </w:pPr>
-    </w:p>
-    <w:p>
-      <w:pPr>
-        <w:spacing w:after="0" w:line="240" w:lineRule="auto"/>
-        <w:contextualSpacing/>
-      </w:pPr>
-    </w:p>
-    <w:p>
-      <w:pPr>
-        <w:spacing w:after="0" w:line="240" w:lineRule="auto"/>
-        <w:contextualSpacing/>
-      </w:pPr>
-    </w:p>
-    <w:p>
-      <w:pPr>
-        <w:spacing w:after="0" w:line="240" w:lineRule="auto"/>
-        <w:contextualSpacing/>
-      </w:pPr>
-    </w:p>
-    <w:p>
-      <w:pPr>
-        <w:spacing w:after="0" w:line="240" w:lineRule="auto"/>
-        <w:contextualSpacing/>
-      </w:pPr>
-    </w:p>
-    <w:p>
-      <w:pPr>
-        <w:spacing w:after="0" w:line="240" w:lineRule="auto"/>
-        <w:contextualSpacing/>
-      </w:pPr>
-    </w:p>
-    <w:p>
-      <w:pPr>
-        <w:spacing w:after="0" w:line="240" w:lineRule="auto"/>
-        <w:contextualSpacing/>
-      </w:pPr>
-    </w:p>
-    <w:p>
-      <w:pPr>
-        <w:spacing w:after="0" w:line="240" w:lineRule="auto"/>
-        <w:contextualSpacing/>
-      </w:pPr>
-    </w:p>
-    <w:p>
-      <w:pPr>
-        <w:spacing w:after="0" w:line="240" w:lineRule="auto"/>
-        <w:contextualSpacing/>
-      </w:pPr>
-    </w:p>
-    <w:p>
-      <w:pPr>
-        <w:spacing w:after="0" w:line="240" w:lineRule="auto"/>
-        <w:contextualSpacing/>
-      </w:pPr>
-    </w:p>
-    <w:p>
-      <w:pPr>
-        <w:spacing w:after="0" w:line="240" w:lineRule="auto"/>
-        <w:contextualSpacing/>
-      </w:pPr>
-    </w:p>
-    <w:p>
-      <w:pPr>
-        <w:spacing w:after="0" w:line="240" w:lineRule="auto"/>
-        <w:contextualSpacing/>
-      </w:pPr>
-    </w:p>
-    <w:p>
-      <w:pPr>
-        <w:spacing w:after="0" w:line="240" w:lineRule="auto"/>
-        <w:contextualSpacing/>
-      </w:pPr>
-    </w:p>
-    <w:p>
-      <w:pPr>
-        <w:spacing w:after="0" w:line="240" w:lineRule="auto"/>
-        <w:contextualSpacing/>
-      </w:pPr>
-    </w:p>
-    <w:p>
-      <w:pPr>
-        <w:spacing w:after="0" w:line="240" w:lineRule="auto"/>
-        <w:contextualSpacing/>
-      </w:pPr>
-    </w:p>
-    <w:p>
-      <w:pPr>
         <w:pStyle w:val="1"/>
       </w:pPr>
-    </w:p>
-    <w:p>
-      <w:pPr>
-        <w:pStyle w:val="1"/>
-      </w:pPr>
-    </w:p>
-    <w:p>
-      <w:pPr>
-        <w:pStyle w:val="1"/>
-      </w:pPr>
-      <w:bookmarkStart w:id="0" w:name="_Toc231928201"/>
+      <w:bookmarkStart w:id="0" w:name="_Toc232015389"/>
       <w:r>
         <w:t>1</w:t>
       </w:r>
@@ -2061,7 +2377,7 @@
       <w:pPr>
         <w:pStyle w:val="2"/>
       </w:pPr>
-      <w:bookmarkStart w:id="1" w:name="_Toc231928202"/>
+      <w:bookmarkStart w:id="1" w:name="_Toc232015390"/>
       <w:r>
         <w:t>1</w:t>
       </w:r>
@@ -2168,7 +2484,7 @@
       <w:pPr>
         <w:pStyle w:val="2"/>
       </w:pPr>
-      <w:bookmarkStart w:id="2" w:name="_Toc231928203"/>
+      <w:bookmarkStart w:id="2" w:name="_Toc232015391"/>
       <w:r>
         <w:t>1</w:t>
       </w:r>
@@ -2216,209 +2532,180 @@
       </w:r>
       <w:proofErr w:type="spellEnd"/>
       <w:r>
-        <w:t xml:space="preserve">, </w:t>
-      </w:r>
-      <w:r>
-        <w:t>δίνοντας</w:t>
-      </w:r>
-      <w:r>
-        <w:t xml:space="preserve"> τη δυνατότητα συμμετοχής σε ζωντανό μάθημα, επικοινωνίας και αλληλεπίδρασης με τον διδάσκοντα.</w:t>
-      </w:r>
-    </w:p>
-    <w:p>
+        <w:t>, δίνοντας τη δυνατότητα συμμετοχής σε ζωντανό μάθημα, επικοινωνίας και αλληλεπίδρασης με τον διδάσκοντα.</w:t>
+      </w:r>
+    </w:p>
+    <w:p>
+      <w:r>
+        <w:t xml:space="preserve">Πιο </w:t>
+      </w:r>
+      <w:r>
+        <w:t>συγκεκριμένα</w:t>
+      </w:r>
+      <w:r>
+        <w:t xml:space="preserve"> η εφαρμογή υποστηρίζει 2 ρόλους, ο ένας ρόλος είναι του μαθητή και ο άλλος ρόλος του καθηγητή. Ο μαθητής μπορεί να </w:t>
+      </w:r>
+      <w:r>
+        <w:t>παρακολουθήσει</w:t>
+      </w:r>
+      <w:r>
+        <w:t xml:space="preserve"> διάφορά μαθήματα αναλόγως με ποιο θα τον συνδέσει ο καθηγητής, ό μαθητής έχει την δυνατότητα να παρακολουθήσει πολλά μαθήματα. Το κάθε μάθημα έχει μία </w:t>
+      </w:r>
+      <w:r>
+        <w:t>θεωρεία</w:t>
+      </w:r>
+      <w:r>
+        <w:t xml:space="preserve"> κατηγοριοποιημένη σε ενότητες και όταν ολοκληρώσει την θεωρεία στο τέλος πρέπει να συμπληρώσει ένα </w:t>
+      </w:r>
+      <w:r>
+        <w:rPr>
+          <w:lang w:val="en-US"/>
+        </w:rPr>
+        <w:t>test</w:t>
+      </w:r>
+      <w:r>
+        <w:t xml:space="preserve"> </w:t>
+      </w:r>
+      <w:r>
+        <w:t xml:space="preserve">στην θεωρεία που διάβασε με δυνατότητα να </w:t>
+      </w:r>
+      <w:proofErr w:type="spellStart"/>
+      <w:r>
+        <w:t>δεί</w:t>
+      </w:r>
+      <w:proofErr w:type="spellEnd"/>
+      <w:r>
+        <w:t xml:space="preserve"> τα λάθη του στο τέλος του τεστ. Από την άλλη ο </w:t>
+      </w:r>
+      <w:r>
+        <w:t>καθηγητής</w:t>
+      </w:r>
+      <w:r>
+        <w:t xml:space="preserve"> έχει την δυνατότητα να </w:t>
+      </w:r>
+      <w:r>
+        <w:t>δημιουργήσει</w:t>
+      </w:r>
+      <w:r>
+        <w:t xml:space="preserve"> νέα </w:t>
+      </w:r>
+      <w:r>
+        <w:t>μαθήματα</w:t>
+      </w:r>
+      <w:r>
+        <w:t xml:space="preserve"> με πολλές ενότητες και διάφορες ερωτήσεις </w:t>
+      </w:r>
+      <w:r>
+        <w:t xml:space="preserve">για το </w:t>
+      </w:r>
+      <w:r>
+        <w:rPr>
+          <w:lang w:val="en-US"/>
+        </w:rPr>
+        <w:t>test</w:t>
+      </w:r>
+      <w:r>
+        <w:t xml:space="preserve"> </w:t>
+      </w:r>
+      <w:r>
+        <w:t>της κάθε θεωρίας. Επίσης ο καθηγητής έχει την δυνατότητα να παρακολουθεί την πορεία του φοιτητή σε σχέση με την θεωρεία και τα αποτελέσματα των τεστ.</w:t>
+      </w:r>
+    </w:p>
+    <w:p>
+      <w:r>
+        <w:t xml:space="preserve">Ακόμα και για τους 2 ρόλους έχουν την δυνατότητα να κάνει </w:t>
+      </w:r>
+      <w:r>
+        <w:rPr>
+          <w:lang w:val="en-US"/>
+        </w:rPr>
+        <w:t>online</w:t>
+      </w:r>
+      <w:r>
+        <w:t xml:space="preserve"> </w:t>
+      </w:r>
+      <w:r>
+        <w:t>μάθημα μέσω της</w:t>
+      </w:r>
+      <w:r>
+        <w:t xml:space="preserve"> </w:t>
+      </w:r>
+      <w:r>
+        <w:rPr>
+          <w:lang w:val="en-US"/>
+        </w:rPr>
+        <w:t>open</w:t>
+      </w:r>
+      <w:r>
+        <w:t xml:space="preserve"> </w:t>
+      </w:r>
+      <w:r>
+        <w:rPr>
+          <w:lang w:val="en-US"/>
+        </w:rPr>
+        <w:t>source</w:t>
+      </w:r>
+      <w:r>
+        <w:t xml:space="preserve"> εφαρμογής του </w:t>
+      </w:r>
+      <w:r>
+        <w:rPr>
+          <w:lang w:val="en-US"/>
+        </w:rPr>
+        <w:t>Big</w:t>
+      </w:r>
+      <w:r>
+        <w:t xml:space="preserve"> </w:t>
+      </w:r>
+      <w:r>
+        <w:rPr>
+          <w:lang w:val="en-US"/>
+        </w:rPr>
+        <w:t>Blue</w:t>
+      </w:r>
+      <w:r>
+        <w:t xml:space="preserve"> </w:t>
+      </w:r>
+      <w:r>
+        <w:rPr>
+          <w:lang w:val="en-US"/>
+        </w:rPr>
+        <w:t>Button</w:t>
+      </w:r>
+      <w:r>
+        <w:t>.</w:t>
+      </w:r>
+      <w:r>
+        <w:t xml:space="preserve">  </w:t>
+      </w:r>
+    </w:p>
+    <w:p>
+      <w:pPr>
+        <w:pStyle w:val="2"/>
+      </w:pPr>
+      <w:bookmarkStart w:id="3" w:name="_Toc232015392"/>
       <w:r>
         <w:lastRenderedPageBreak/>
-        <w:t xml:space="preserve">Πιο </w:t>
-      </w:r>
-      <w:r>
-        <w:t>συγκεκριμένα</w:t>
-      </w:r>
-      <w:r>
-        <w:t xml:space="preserve"> η εφαρμογή υποστηρίζει 2 ρόλους, ο ένας ρόλος είναι του μαθητή και ο άλλος ρόλος του καθηγητή. Ο μαθητής μπορεί να </w:t>
-      </w:r>
-      <w:r>
-        <w:t>παρακολουθήσει</w:t>
-      </w:r>
-      <w:r>
-        <w:t xml:space="preserve"> διάφορά μαθήματα αναλόγως με ποιο θα τον συνδέσει ο καθηγητής, ό μαθητής έχει την δυνατότητα να παρακολουθήσει πολλά μαθήματα. Το κάθε μάθημα έχει μία </w:t>
-      </w:r>
-      <w:r>
-        <w:t>θεωρεία</w:t>
-      </w:r>
-      <w:r>
-        <w:t xml:space="preserve"> κατηγοριοποιημένη σε ενότητες και όταν ολοκληρώσει την θεωρεία στο τέλος πρέπει να συμπληρώσει ένα </w:t>
-      </w:r>
-      <w:r>
-        <w:rPr>
-          <w:lang w:val="en-US"/>
-        </w:rPr>
-        <w:t>test</w:t>
+        <w:t>1</w:t>
+      </w:r>
+      <w:r>
+        <w:t>.</w:t>
+      </w:r>
+      <w:r>
+        <w:t xml:space="preserve"> 3</w:t>
+      </w:r>
+      <w:r>
+        <w:t>.</w:t>
       </w:r>
       <w:r>
         <w:t xml:space="preserve"> </w:t>
       </w:r>
       <w:r>
-        <w:t xml:space="preserve">στην θεωρεία που διάβασε με δυνατότητα να </w:t>
-      </w:r>
-      <w:proofErr w:type="spellStart"/>
-      <w:r>
-        <w:t>δεί</w:t>
-      </w:r>
-      <w:proofErr w:type="spellEnd"/>
-      <w:r>
-        <w:t xml:space="preserve"> τα λάθη του στο τέλος του τεστ. Από την άλλη ο </w:t>
-      </w:r>
-      <w:r>
-        <w:t>καθηγητής</w:t>
-      </w:r>
-      <w:r>
-        <w:t xml:space="preserve"> έχει την δυνατότητα να </w:t>
-      </w:r>
-      <w:r>
-        <w:t>δημιουργήσει</w:t>
-      </w:r>
-      <w:r>
-        <w:t xml:space="preserve"> νέα </w:t>
-      </w:r>
-      <w:r>
-        <w:t>μαθήματα</w:t>
-      </w:r>
-      <w:r>
-        <w:t xml:space="preserve"> με πολλές ενότητες και διάφορες ερωτήσεις </w:t>
-      </w:r>
-      <w:r>
-        <w:t xml:space="preserve">για το </w:t>
-      </w:r>
-      <w:r>
-        <w:rPr>
-          <w:lang w:val="en-US"/>
-        </w:rPr>
-        <w:t>test</w:t>
-      </w:r>
-      <w:r>
-        <w:t xml:space="preserve"> </w:t>
-      </w:r>
-      <w:r>
-        <w:t>της κάθε θεωρίας. Επίσης ο καθηγητής έχει την δυνατότητα να παρακολουθεί την πορεία του φοιτητή σε σχέση με την θεωρεία και τα αποτελέσματα των τεστ.</w:t>
-      </w:r>
-    </w:p>
-    <w:p>
-      <w:pPr>
-        <w:rPr>
-          <w:lang w:val="en-US"/>
-        </w:rPr>
-      </w:pPr>
-      <w:r>
-        <w:t xml:space="preserve">Ακόμα και για τους 2 ρόλους έχουν την δυνατότητα να κάνει </w:t>
-      </w:r>
-      <w:r>
-        <w:rPr>
-          <w:lang w:val="en-US"/>
-        </w:rPr>
-        <w:t>online</w:t>
-      </w:r>
-      <w:r>
-        <w:t xml:space="preserve"> </w:t>
-      </w:r>
-      <w:r>
-        <w:t>μάθημα μέσω της</w:t>
-      </w:r>
-      <w:r>
-        <w:t xml:space="preserve"> </w:t>
-      </w:r>
-      <w:r>
-        <w:rPr>
-          <w:lang w:val="en-US"/>
-        </w:rPr>
-        <w:t>open</w:t>
-      </w:r>
-      <w:r>
-        <w:t xml:space="preserve"> </w:t>
-      </w:r>
-      <w:r>
-        <w:rPr>
-          <w:lang w:val="en-US"/>
-        </w:rPr>
-        <w:t>source</w:t>
-      </w:r>
-      <w:r>
-        <w:t xml:space="preserve"> εφαρμογής του </w:t>
-      </w:r>
-      <w:r>
-        <w:rPr>
-          <w:lang w:val="en-US"/>
-        </w:rPr>
-        <w:t>Big</w:t>
-      </w:r>
-      <w:r>
-        <w:t xml:space="preserve"> </w:t>
-      </w:r>
-      <w:r>
-        <w:rPr>
-          <w:lang w:val="en-US"/>
-        </w:rPr>
-        <w:t>Blue</w:t>
-      </w:r>
-      <w:r>
-        <w:t xml:space="preserve"> </w:t>
-      </w:r>
-      <w:r>
-        <w:rPr>
-          <w:lang w:val="en-US"/>
-        </w:rPr>
-        <w:t>Button</w:t>
-      </w:r>
-      <w:r>
-        <w:t>.</w:t>
-      </w:r>
-      <w:r>
-        <w:t xml:space="preserve">  </w:t>
-      </w:r>
-    </w:p>
-    <w:p>
-      <w:pPr>
-        <w:pStyle w:val="2"/>
-        <w:rPr>
-          <w:lang w:val="en-US"/>
-        </w:rPr>
-      </w:pPr>
-      <w:bookmarkStart w:id="3" w:name="_Toc231928204"/>
-      <w:r>
-        <w:rPr>
-          <w:lang w:val="en-US"/>
-        </w:rPr>
-        <w:t>1</w:t>
-      </w:r>
-      <w:r>
-        <w:t>.</w:t>
-      </w:r>
-      <w:r>
-        <w:rPr>
-          <w:lang w:val="en-US"/>
-        </w:rPr>
-        <w:t xml:space="preserve"> 3</w:t>
-      </w:r>
-      <w:r>
-        <w:t>.</w:t>
-      </w:r>
-      <w:r>
-        <w:rPr>
-          <w:lang w:val="en-US"/>
-        </w:rPr>
-        <w:t xml:space="preserve"> </w:t>
-      </w:r>
-      <w:r>
         <w:t>Τεχνολογικό Υπόβαθρο Εφαρμογής</w:t>
       </w:r>
       <w:bookmarkEnd w:id="3"/>
     </w:p>
-    <w:p>
-      <w:pPr>
-        <w:rPr>
-          <w:lang w:val="en-US"/>
-        </w:rPr>
-      </w:pPr>
-    </w:p>
+    <w:p/>
     <w:p>
       <w:r>
         <w:t xml:space="preserve">Η εφαρμογή αναπτύχθηκε στη γλώσσα </w:t>
@@ -2611,12 +2898,9 @@
       <w:pPr>
         <w:pStyle w:val="1"/>
       </w:pPr>
-      <w:bookmarkStart w:id="4" w:name="_Toc231928205"/>
-      <w:r>
-        <w:t>2</w:t>
-      </w:r>
-      <w:r>
-        <w:t>.</w:t>
+      <w:bookmarkStart w:id="4" w:name="_Toc232015393"/>
+      <w:r>
+        <w:t>2.</w:t>
       </w:r>
       <w:r>
         <w:t xml:space="preserve"> </w:t>
@@ -2661,7 +2945,7 @@
       <w:pPr>
         <w:pStyle w:val="2"/>
       </w:pPr>
-      <w:bookmarkStart w:id="5" w:name="_Toc231928206"/>
+      <w:bookmarkStart w:id="5" w:name="_Toc232015394"/>
       <w:r>
         <w:t>2. 1. Λειτουργίες Μαθητή</w:t>
       </w:r>
@@ -2678,7 +2962,7 @@
       <w:pPr>
         <w:pStyle w:val="3"/>
       </w:pPr>
-      <w:bookmarkStart w:id="6" w:name="_Toc231928207"/>
+      <w:bookmarkStart w:id="6" w:name="_Toc232015395"/>
       <w:r>
         <w:t>2. 1. 1. Σύνδεση Μαθητή στο σύστημα</w:t>
       </w:r>
@@ -2687,7 +2971,9 @@
     <w:p/>
     <w:p>
       <w:r>
-        <w:lastRenderedPageBreak/>
+        <w:rPr>
+          <w:noProof/>
+        </w:rPr>
         <w:drawing>
           <wp:inline distT="0" distB="0" distL="0" distR="0" wp14:anchorId="50503F7F" wp14:editId="4FD9AED2">
             <wp:extent cx="5950479" cy="3352800"/>
@@ -2742,84 +3028,78 @@
       </w:r>
     </w:p>
     <w:p>
-      <w:pPr>
+      <w:r>
+        <w:lastRenderedPageBreak/>
+        <w:t xml:space="preserve">Στην πιο πάνω εικόνα εμφανίζεται η σελίδα που μπορεί να κάνει σύνδεση ο μαθητής στο σύστημα, </w:t>
+      </w:r>
+      <w:proofErr w:type="spellStart"/>
+      <w:r>
+        <w:t>μετα</w:t>
+      </w:r>
+      <w:proofErr w:type="spellEnd"/>
+      <w:r>
+        <w:t xml:space="preserve"> την δημιουργία όνομα χρήστη και κωδικού από τον καθηγητή. Σε περίπτωση που γίνει η εφαρμογή </w:t>
+      </w:r>
+      <w:r>
         <w:rPr>
           <w:lang w:val="en-US"/>
         </w:rPr>
-      </w:pPr>
-      <w:r>
-        <w:t xml:space="preserve">Στην πιο πάνω εικόνα εμφανίζεται η σελίδα που μπορεί να κάνει σύνδεση ο μαθητής στο σύστημα, </w:t>
-      </w:r>
-      <w:proofErr w:type="spellStart"/>
-      <w:r>
-        <w:t>μετα</w:t>
-      </w:r>
-      <w:proofErr w:type="spellEnd"/>
-      <w:r>
-        <w:t xml:space="preserve"> την δημιουργία όνομα χρήστη και κωδικού από τον καθηγητή. Σε περίπτωση που γίνει η εφαρμογή </w:t>
+        <w:t>deploy</w:t>
+      </w:r>
+      <w:r>
+        <w:t xml:space="preserve"> </w:t>
+      </w:r>
+      <w:r>
+        <w:t xml:space="preserve">σε </w:t>
       </w:r>
       <w:r>
         <w:rPr>
           <w:lang w:val="en-US"/>
         </w:rPr>
-        <w:t>deploy</w:t>
+        <w:t>production</w:t>
       </w:r>
       <w:r>
         <w:t xml:space="preserve"> </w:t>
       </w:r>
       <w:r>
-        <w:t xml:space="preserve">σε </w:t>
+        <w:t xml:space="preserve">η εφαρμογή μπορεί να υποστηρίζει αποστολή των στοιχείων μέσω </w:t>
       </w:r>
       <w:r>
         <w:rPr>
           <w:lang w:val="en-US"/>
         </w:rPr>
-        <w:t>production</w:t>
-      </w:r>
-      <w:r>
-        <w:t xml:space="preserve"> </w:t>
-      </w:r>
-      <w:r>
-        <w:t xml:space="preserve">η εφαρμογή μπορεί να υποστηρίζει αποστολή των στοιχείων μέσω </w:t>
+        <w:t>email</w:t>
+      </w:r>
+      <w:r>
+        <w:t>.</w:t>
+      </w:r>
+      <w:r>
+        <w:t xml:space="preserve">   </w:t>
+      </w:r>
+    </w:p>
+    <w:p>
+      <w:pPr>
+        <w:pStyle w:val="3"/>
+      </w:pPr>
+      <w:bookmarkStart w:id="7" w:name="_Toc232015396"/>
+      <w:r>
+        <w:t xml:space="preserve">2. 1. </w:t>
       </w:r>
       <w:r>
         <w:rPr>
           <w:lang w:val="en-US"/>
         </w:rPr>
-        <w:t>email</w:t>
-      </w:r>
-      <w:r>
-        <w:t>.</w:t>
-      </w:r>
-      <w:r>
-        <w:t xml:space="preserve">   </w:t>
-      </w:r>
-    </w:p>
-    <w:p>
-      <w:pPr>
-        <w:pStyle w:val="3"/>
-      </w:pPr>
-      <w:bookmarkStart w:id="7" w:name="_Toc231928208"/>
-      <w:r>
-        <w:t xml:space="preserve">2. 1. </w:t>
-      </w:r>
-      <w:r>
-        <w:rPr>
-          <w:lang w:val="en-US"/>
-        </w:rPr>
         <w:t>2</w:t>
       </w:r>
       <w:r>
-        <w:t xml:space="preserve">. </w:t>
-      </w:r>
-      <w:r>
-        <w:t>Διαθέσιμα Μαθήματα του Μαθητή</w:t>
+        <w:t>. Διαθέσιμα Μαθήματα του Μαθητή</w:t>
       </w:r>
       <w:bookmarkEnd w:id="7"/>
     </w:p>
     <w:p>
       <w:r>
         <w:rPr>
+          <w:noProof/>
           <w:lang w:val="en-US"/>
         </w:rPr>
         <w:drawing>
@@ -2884,100 +3164,99 @@
     </w:p>
     <w:p>
       <w:r>
+        <w:t xml:space="preserve">Στην παραπάνω εικόνα βλέπουμε τα διαθέσιμα μαθήματα που μπορεί να παρακολουθήσει ο μαθητής. Όπως </w:t>
+      </w:r>
+      <w:proofErr w:type="spellStart"/>
+      <w:r>
+        <w:t>φενεται</w:t>
+      </w:r>
+      <w:proofErr w:type="spellEnd"/>
+      <w:r>
+        <w:t xml:space="preserve"> και στην εικόνα ακόμα δεν έχει ξεκινήσει </w:t>
+      </w:r>
+      <w:proofErr w:type="spellStart"/>
+      <w:r>
+        <w:t>κάνενα</w:t>
+      </w:r>
+      <w:proofErr w:type="spellEnd"/>
+      <w:r>
+        <w:t xml:space="preserve"> μάθημα γιατί η πρόοδός σε όλα είναι 0%. Επίσης κανένα μάθημα δεν είναι </w:t>
+      </w:r>
+      <w:r>
+        <w:rPr>
+          <w:lang w:val="en-US"/>
+        </w:rPr>
+        <w:t>online</w:t>
+      </w:r>
+      <w:r>
+        <w:t>.</w:t>
+      </w:r>
+    </w:p>
+    <w:p>
+      <w:pPr>
+        <w:rPr>
+          <w:b/>
+          <w:bCs/>
+        </w:rPr>
+      </w:pPr>
+      <w:r>
+        <w:t xml:space="preserve">Στην πιο κάτω </w:t>
+      </w:r>
+      <w:r>
+        <w:t>«</w:t>
+      </w:r>
+      <w:r>
+        <w:rPr>
+          <w:i/>
+          <w:iCs/>
+        </w:rPr>
+        <w:t xml:space="preserve">εικόνα </w:t>
+      </w:r>
+      <w:r>
+        <w:rPr>
+          <w:i/>
+          <w:iCs/>
+        </w:rPr>
+        <w:t>3»</w:t>
+      </w:r>
+      <w:r>
+        <w:t xml:space="preserve"> βλέπουμε όταν ο μαθητής έχει διαβάσει ένα μέρος της θεωρίας, πχ στο μάθημα «</w:t>
+      </w:r>
+      <w:r>
+        <w:rPr>
+          <w:b/>
+          <w:bCs/>
+        </w:rPr>
+        <w:t xml:space="preserve">Προσωπικά Δεδομένα &amp; </w:t>
+      </w:r>
+      <w:proofErr w:type="spellStart"/>
+      <w:r>
+        <w:rPr>
+          <w:b/>
+          <w:bCs/>
+        </w:rPr>
+        <w:t>Ιδιωτικότητα</w:t>
+      </w:r>
+      <w:proofErr w:type="spellEnd"/>
+      <w:r>
+        <w:t xml:space="preserve">» έχει διαβάσει το 67% δηλαδή 5 στις 6 ενότητες γιατί η ολοκλήρωση της θεωρίας φτάνει στο 80% και το άλλο 20% είναι το </w:t>
+      </w:r>
+      <w:r>
+        <w:rPr>
+          <w:lang w:val="en-US"/>
+        </w:rPr>
+        <w:t>test</w:t>
+      </w:r>
+      <w:r>
+        <w:t>.</w:t>
+      </w:r>
+    </w:p>
+    <w:p>
+      <w:r>
+        <w:rPr>
+          <w:noProof/>
+        </w:rPr>
         <w:lastRenderedPageBreak/>
-        <w:t xml:space="preserve">Στην παραπάνω εικόνα βλέπουμε τα διαθέσιμα μαθήματα που μπορεί να παρακολουθήσει ο μαθητής. Όπως </w:t>
-      </w:r>
-      <w:proofErr w:type="spellStart"/>
-      <w:r>
-        <w:t>φενεται</w:t>
-      </w:r>
-      <w:proofErr w:type="spellEnd"/>
-      <w:r>
-        <w:t xml:space="preserve"> και στην εικόνα ακόμα δεν έχει ξεκινήσει </w:t>
-      </w:r>
-      <w:proofErr w:type="spellStart"/>
-      <w:r>
-        <w:t>κάνενα</w:t>
-      </w:r>
-      <w:proofErr w:type="spellEnd"/>
-      <w:r>
-        <w:t xml:space="preserve"> μάθημα γιατί η πρόοδός σε όλα είναι 0%. Επίσης κανένα μάθημα δεν είναι </w:t>
-      </w:r>
-      <w:r>
-        <w:rPr>
-          <w:lang w:val="en-US"/>
-        </w:rPr>
-        <w:t>online.</w:t>
-      </w:r>
-    </w:p>
-    <w:p>
-      <w:pPr>
-        <w:rPr>
-          <w:b/>
-          <w:bCs/>
-        </w:rPr>
-      </w:pPr>
-      <w:r>
-        <w:t xml:space="preserve">Στην πιο κάτω </w:t>
-      </w:r>
-      <w:r>
-        <w:t>«</w:t>
-      </w:r>
-      <w:r>
-        <w:rPr>
-          <w:i/>
-          <w:iCs/>
-        </w:rPr>
-        <w:t xml:space="preserve">εικόνα </w:t>
-      </w:r>
-      <w:r>
-        <w:rPr>
-          <w:i/>
-          <w:iCs/>
-        </w:rPr>
-        <w:t>3</w:t>
-      </w:r>
-      <w:r>
-        <w:rPr>
-          <w:i/>
-          <w:iCs/>
-        </w:rPr>
-        <w:t>»</w:t>
-      </w:r>
-      <w:r>
-        <w:t xml:space="preserve"> βλέπουμε όταν ο μαθητής έχει διαβάσει ένα μέρος της θεωρίας, πχ στο μάθημα «</w:t>
-      </w:r>
-      <w:r>
-        <w:rPr>
-          <w:b/>
-          <w:bCs/>
-        </w:rPr>
-        <w:t xml:space="preserve">Προσωπικά Δεδομένα &amp; </w:t>
-      </w:r>
-      <w:proofErr w:type="spellStart"/>
-      <w:r>
-        <w:rPr>
-          <w:b/>
-          <w:bCs/>
-        </w:rPr>
-        <w:t>Ιδιωτικότητα</w:t>
-      </w:r>
-      <w:proofErr w:type="spellEnd"/>
-      <w:r>
-        <w:t xml:space="preserve">» έχει διαβάσει το 67% δηλαδή 5 στις 6 ενότητες γιατί η ολοκλήρωση της θεωρίας φτάνει στο 80% και το άλλο 20% είναι το </w:t>
-      </w:r>
-      <w:r>
-        <w:rPr>
-          <w:lang w:val="en-US"/>
-        </w:rPr>
-        <w:t>test</w:t>
-      </w:r>
-      <w:r>
-        <w:t>.</w:t>
-      </w:r>
-    </w:p>
-    <w:p>
-      <w:r>
         <w:drawing>
           <wp:inline distT="0" distB="0" distL="0" distR="0" wp14:anchorId="4EF205BA" wp14:editId="63B9AE4C">
             <wp:extent cx="6034093" cy="3192780"/>
@@ -3045,30 +3324,12 @@
       <w:pPr>
         <w:pStyle w:val="3"/>
       </w:pPr>
-      <w:bookmarkStart w:id="8" w:name="_Toc231928209"/>
-      <w:r>
-        <w:t xml:space="preserve">2. 1. </w:t>
-      </w:r>
-      <w:r>
-        <w:t>3</w:t>
-      </w:r>
-      <w:r>
-        <w:t xml:space="preserve">. </w:t>
-      </w:r>
-      <w:r>
-        <w:t>Είσοδος</w:t>
-      </w:r>
-      <w:r>
-        <w:t xml:space="preserve"> μαθητή</w:t>
-      </w:r>
-      <w:r>
-        <w:t xml:space="preserve"> σ</w:t>
-      </w:r>
-      <w:r>
-        <w:t>ε</w:t>
-      </w:r>
-      <w:r>
-        <w:t xml:space="preserve"> Live Μάθημα</w:t>
+      <w:bookmarkStart w:id="8" w:name="_Toc232015397"/>
+      <w:r>
+        <w:t xml:space="preserve">2. 1. 3. </w:t>
+      </w:r>
+      <w:r>
+        <w:t>Είσοδος μαθητή σε Live Μάθημα</w:t>
       </w:r>
       <w:bookmarkEnd w:id="8"/>
     </w:p>
@@ -3092,14 +3353,7 @@
           <w:i/>
           <w:iCs/>
         </w:rPr>
-        <w:t>4</w:t>
-      </w:r>
-      <w:r>
-        <w:rPr>
-          <w:i/>
-          <w:iCs/>
-        </w:rPr>
-        <w:t>»</w:t>
+        <w:t>4»</w:t>
       </w:r>
       <w:r>
         <w:t xml:space="preserve"> βλέπουμε ότι έχει ενεργοποιηθεί του κουμπί «</w:t>
@@ -3126,7 +3380,9 @@
     </w:p>
     <w:p>
       <w:r>
-        <w:lastRenderedPageBreak/>
+        <w:rPr>
+          <w:noProof/>
+        </w:rPr>
         <w:drawing>
           <wp:inline distT="0" distB="0" distL="0" distR="0" wp14:anchorId="59BE7A8A" wp14:editId="5065BFFF">
             <wp:extent cx="6120130" cy="3782060"/>
@@ -3222,10 +3478,7 @@
         <w:t xml:space="preserve"> κάποιο χεράκι σε περίπτωση ερωτήσεων</w:t>
       </w:r>
       <w:r>
-        <w:t xml:space="preserve"> </w:t>
-      </w:r>
-      <w:r>
-        <w:t>«</w:t>
+        <w:t xml:space="preserve"> «</w:t>
       </w:r>
       <w:r>
         <w:rPr>
@@ -3239,14 +3492,7 @@
           <w:i/>
           <w:iCs/>
         </w:rPr>
-        <w:t>5</w:t>
-      </w:r>
-      <w:r>
-        <w:rPr>
-          <w:i/>
-          <w:iCs/>
-        </w:rPr>
-        <w:t>»</w:t>
+        <w:t>5»</w:t>
       </w:r>
       <w:r>
         <w:t>.</w:t>
@@ -3254,6 +3500,10 @@
     </w:p>
     <w:p>
       <w:r>
+        <w:rPr>
+          <w:noProof/>
+        </w:rPr>
+        <w:lastRenderedPageBreak/>
         <w:drawing>
           <wp:inline distT="0" distB="0" distL="0" distR="0" wp14:anchorId="5DEA2E82" wp14:editId="492201E9">
             <wp:extent cx="6120130" cy="3009900"/>
@@ -3340,15 +3590,9 @@
       <w:pPr>
         <w:pStyle w:val="3"/>
       </w:pPr>
-      <w:bookmarkStart w:id="9" w:name="_Toc231928210"/>
-      <w:r>
-        <w:t xml:space="preserve">2. 1. </w:t>
-      </w:r>
-      <w:r>
-        <w:t>4</w:t>
-      </w:r>
-      <w:r>
-        <w:t xml:space="preserve">. </w:t>
+      <w:bookmarkStart w:id="9" w:name="_Toc232015398"/>
+      <w:r>
+        <w:t xml:space="preserve">2. 1. 4. </w:t>
       </w:r>
       <w:r>
         <w:t>Είσοδος μαθητή σ</w:t>
@@ -3381,14 +3625,7 @@
           <w:i/>
           <w:iCs/>
         </w:rPr>
-        <w:t>6</w:t>
-      </w:r>
-      <w:r>
-        <w:rPr>
-          <w:i/>
-          <w:iCs/>
-        </w:rPr>
-        <w:t>»</w:t>
+        <w:t>6»</w:t>
       </w:r>
       <w:r>
         <w:t>.</w:t>
@@ -3396,7 +3633,9 @@
     </w:p>
     <w:p>
       <w:r>
-        <w:lastRenderedPageBreak/>
+        <w:rPr>
+          <w:noProof/>
+        </w:rPr>
         <w:drawing>
           <wp:inline distT="0" distB="0" distL="0" distR="0" wp14:anchorId="556F5E66" wp14:editId="7F27E96D">
             <wp:extent cx="6120130" cy="2758440"/>
@@ -3511,6 +3750,10 @@
     </w:p>
     <w:p>
       <w:r>
+        <w:rPr>
+          <w:noProof/>
+        </w:rPr>
+        <w:lastRenderedPageBreak/>
         <w:drawing>
           <wp:inline distT="0" distB="0" distL="0" distR="0" wp14:anchorId="35590CD3" wp14:editId="50D606D2">
             <wp:extent cx="6120130" cy="3212465"/>
@@ -3667,15 +3910,9 @@
       <w:pPr>
         <w:pStyle w:val="3"/>
       </w:pPr>
-      <w:bookmarkStart w:id="10" w:name="_Toc231928211"/>
-      <w:r>
-        <w:t xml:space="preserve">2. 1. </w:t>
-      </w:r>
-      <w:r>
-        <w:t>5</w:t>
-      </w:r>
-      <w:r>
-        <w:t xml:space="preserve">. </w:t>
+      <w:bookmarkStart w:id="10" w:name="_Toc232015399"/>
+      <w:r>
+        <w:t xml:space="preserve">2. 1. 5. </w:t>
       </w:r>
       <w:r>
         <w:t xml:space="preserve">Είσοδος μαθητή </w:t>
@@ -3720,7 +3957,9 @@
     </w:p>
     <w:p>
       <w:r>
-        <w:lastRenderedPageBreak/>
+        <w:rPr>
+          <w:noProof/>
+        </w:rPr>
         <w:drawing>
           <wp:inline distT="0" distB="0" distL="0" distR="0" wp14:anchorId="65954908" wp14:editId="2B1F94AB">
             <wp:extent cx="6120130" cy="3246755"/>
@@ -3803,23 +4042,13 @@
           <w:i/>
           <w:iCs/>
         </w:rPr>
-        <w:t>8</w:t>
-      </w:r>
-      <w:r>
-        <w:rPr>
-          <w:i/>
-          <w:iCs/>
-        </w:rPr>
-        <w:t>»</w:t>
+        <w:t>8»</w:t>
       </w:r>
       <w:r>
         <w:t xml:space="preserve"> φαίνονται οι διαθέσιμες ερωτήσεις με τις επιλογές απάντησης. Αφού ο μαθητής ολοκληρώσει την θεωρεία </w:t>
       </w:r>
       <w:r>
-        <w:t xml:space="preserve">μπορεί να δει τις απαντήσεις του όπως φαίνεται στην </w:t>
-      </w:r>
-      <w:r>
-        <w:t>«</w:t>
+        <w:t>μπορεί να δει τις απαντήσεις του όπως φαίνεται στην «</w:t>
       </w:r>
       <w:r>
         <w:rPr>
@@ -3833,14 +4062,7 @@
           <w:i/>
           <w:iCs/>
         </w:rPr>
-        <w:t>9</w:t>
-      </w:r>
-      <w:r>
-        <w:rPr>
-          <w:i/>
-          <w:iCs/>
-        </w:rPr>
-        <w:t>»</w:t>
+        <w:t>9»</w:t>
       </w:r>
       <w:r>
         <w:rPr>
@@ -3859,6 +4081,10 @@
     <w:p/>
     <w:p>
       <w:r>
+        <w:rPr>
+          <w:noProof/>
+        </w:rPr>
+        <w:lastRenderedPageBreak/>
         <w:drawing>
           <wp:inline distT="0" distB="0" distL="0" distR="0" wp14:anchorId="11302CE1" wp14:editId="607CD758">
             <wp:extent cx="6120130" cy="3342640"/>
@@ -3932,10 +4158,54 @@
         <w:t>test</w:t>
       </w:r>
       <w:r>
+        <w:t xml:space="preserve"> «</w:t>
+      </w:r>
+      <w:r>
+        <w:rPr>
+          <w:i/>
+          <w:iCs/>
+        </w:rPr>
+        <w:t xml:space="preserve">εικόνα </w:t>
+      </w:r>
+      <w:r>
+        <w:rPr>
+          <w:i/>
+          <w:iCs/>
+        </w:rPr>
+        <w:t>9»</w:t>
+      </w:r>
+      <w:r>
         <w:t xml:space="preserve"> </w:t>
       </w:r>
       <w:r>
-        <w:t>«</w:t>
+        <w:t xml:space="preserve">και στην συνέχεια να μπορεί να δει το συνολικό ποσοστό του αποτελέσματος από το </w:t>
+      </w:r>
+      <w:r>
+        <w:rPr>
+          <w:lang w:val="en-US"/>
+        </w:rPr>
+        <w:t>test</w:t>
+      </w:r>
+      <w:r>
+        <w:t xml:space="preserve"> τις λάθος απαντήσεις με τις σωστές απαντήσεις</w:t>
+      </w:r>
+      <w:r>
+        <w:t xml:space="preserve"> </w:t>
+      </w:r>
+      <w:r>
+        <w:t>και να τ</w:t>
+      </w:r>
+      <w:r>
+        <w:t>α</w:t>
+      </w:r>
+      <w:r>
+        <w:t xml:space="preserve"> συζητήσει</w:t>
+      </w:r>
+      <w:r>
+        <w:t xml:space="preserve"> όλα</w:t>
+      </w:r>
+      <w:r>
+        <w:t xml:space="preserve"> με τον καθηγητή που τον επιβλέπει «</w:t>
       </w:r>
       <w:r>
         <w:rPr>
@@ -3949,76 +4219,14 @@
           <w:i/>
           <w:iCs/>
         </w:rPr>
-        <w:t>9»</w:t>
-      </w:r>
-      <w:r>
-        <w:t xml:space="preserve"> </w:t>
-      </w:r>
-      <w:r>
-        <w:t xml:space="preserve">και στην συνέχεια να μπορεί να δει το συνολικό ποσοστό του αποτελέσματος από το </w:t>
-      </w:r>
-      <w:r>
-        <w:rPr>
-          <w:lang w:val="en-US"/>
-        </w:rPr>
-        <w:t>test</w:t>
-      </w:r>
-      <w:r>
-        <w:t xml:space="preserve"> τις λάθος απαντήσεις με τις σωστές απαντήσεις</w:t>
-      </w:r>
-      <w:r>
-        <w:t xml:space="preserve"> </w:t>
-      </w:r>
-      <w:r>
-        <w:t>και να τ</w:t>
-      </w:r>
-      <w:r>
-        <w:t>α</w:t>
-      </w:r>
-      <w:r>
-        <w:t xml:space="preserve"> συζητήσει</w:t>
-      </w:r>
-      <w:r>
-        <w:t xml:space="preserve"> όλα</w:t>
-      </w:r>
-      <w:r>
-        <w:t xml:space="preserve"> με τον καθηγητή που τον επιβλέπει </w:t>
-      </w:r>
-      <w:r>
-        <w:t>«</w:t>
-      </w:r>
-      <w:r>
-        <w:rPr>
-          <w:i/>
-          <w:iCs/>
-        </w:rPr>
-        <w:t xml:space="preserve">εικόνα </w:t>
-      </w:r>
-      <w:r>
-        <w:rPr>
-          <w:i/>
-          <w:iCs/>
-        </w:rPr>
-        <w:t>10</w:t>
-      </w:r>
-      <w:r>
-        <w:rPr>
-          <w:i/>
-          <w:iCs/>
-        </w:rPr>
-        <w:t>»</w:t>
-      </w:r>
-      <w:r>
-        <w:rPr>
-          <w:i/>
-          <w:iCs/>
-        </w:rPr>
-        <w:t>.</w:t>
-      </w:r>
-    </w:p>
-    <w:p>
-      <w:r>
-        <w:lastRenderedPageBreak/>
+        <w:t>10».</w:t>
+      </w:r>
+    </w:p>
+    <w:p>
+      <w:r>
+        <w:rPr>
+          <w:noProof/>
+        </w:rPr>
         <w:drawing>
           <wp:inline distT="0" distB="0" distL="0" distR="0" wp14:anchorId="0E9C31CC" wp14:editId="387B1677">
             <wp:extent cx="6120130" cy="3263900"/>
@@ -4080,13 +4288,25 @@
       </w:r>
     </w:p>
     <w:p>
-      <w:pPr>
+      <w:r>
+        <w:t xml:space="preserve">Ο μαθητής έχει την επιλογή να κάνει ξανά το </w:t>
+      </w:r>
+      <w:r>
         <w:rPr>
           <w:lang w:val="en-US"/>
         </w:rPr>
-      </w:pPr>
-      <w:r>
-        <w:t xml:space="preserve">Ο μαθητής έχει την επιλογή να κάνει ξανά το </w:t>
+        <w:t>test</w:t>
+      </w:r>
+      <w:r>
+        <w:t xml:space="preserve">, </w:t>
+      </w:r>
+      <w:r>
+        <w:t>σε περίπτωση που το αποτέλεσμα είναι μικρότερο από το 100%.</w:t>
+      </w:r>
+    </w:p>
+    <w:p>
+      <w:r>
+        <w:t xml:space="preserve">Σε περίπτωση που ολοκληρώσει όλο το </w:t>
       </w:r>
       <w:r>
         <w:rPr>
@@ -4095,152 +4315,116 @@
         <w:t>test</w:t>
       </w:r>
       <w:r>
-        <w:t xml:space="preserve">, </w:t>
-      </w:r>
-      <w:r>
-        <w:t>σε περίπτωση που το αποτέλεσμα είναι μικρότερο από το 100%.</w:t>
-      </w:r>
-    </w:p>
-    <w:p>
-      <w:r>
-        <w:t xml:space="preserve">Σε περίπτωση που ολοκληρώσει όλο το </w:t>
+        <w:t xml:space="preserve"> </w:t>
+      </w:r>
+      <w:r>
+        <w:t xml:space="preserve">με </w:t>
+      </w:r>
+      <w:r>
+        <w:t xml:space="preserve">100%, </w:t>
+      </w:r>
+      <w:r>
+        <w:t xml:space="preserve">μπορεί να μεταβεί σε επόμενη θεωρεία.  </w:t>
+      </w:r>
+    </w:p>
+    <w:p>
+      <w:r>
+        <w:t xml:space="preserve">Ο σκοπός της Ηλεκτρονικής εφαρμογής που αναπτύξαμε από τον ρόλο του μαθητή είναι να είναι κατά την διάρκεια όλου του Μαθήματος </w:t>
       </w:r>
       <w:r>
         <w:rPr>
           <w:lang w:val="en-US"/>
         </w:rPr>
+        <w:t>online</w:t>
+      </w:r>
+      <w:r>
+        <w:t xml:space="preserve"> </w:t>
+      </w:r>
+      <w:r>
+        <w:t xml:space="preserve">από την παρουσίαση του καθηγητή μέχρι την ολοκλήρωση του </w:t>
+      </w:r>
+      <w:r>
+        <w:rPr>
+          <w:lang w:val="en-US"/>
+        </w:rPr>
         <w:t>test</w:t>
       </w:r>
       <w:r>
+        <w:t>.</w:t>
+      </w:r>
+    </w:p>
+    <w:p/>
+    <w:p>
+      <w:pPr>
+        <w:pStyle w:val="2"/>
+      </w:pPr>
+      <w:bookmarkStart w:id="11" w:name="_Toc232015400"/>
+      <w:r>
+        <w:lastRenderedPageBreak/>
+        <w:t>2. 2. Λειτουργίες Καθηγητή</w:t>
+      </w:r>
+      <w:bookmarkEnd w:id="11"/>
+    </w:p>
+    <w:p/>
+    <w:p>
+      <w:r>
+        <w:t xml:space="preserve">Σε αυτή την ενότητα θα παρουσιάσουμε τις διαθέσιμες λειτουργίες που έχει ο ρόλος του Καθηγητή. Ο συγκεκριμένος ρόλος έχει περισσότερες διαχειρίστηκες λειτουργίες στην εφαρμογή, γιατί η εφαρμογή μπορεί να </w:t>
+      </w:r>
+      <w:proofErr w:type="spellStart"/>
+      <w:r>
+        <w:t>εγκατασταθή</w:t>
+      </w:r>
+      <w:proofErr w:type="spellEnd"/>
+      <w:r>
+        <w:t xml:space="preserve"> σε κάποιο οργανισμό σε κάποιο </w:t>
+      </w:r>
+      <w:r>
+        <w:rPr>
+          <w:lang w:val="en-US"/>
+        </w:rPr>
+        <w:t>server</w:t>
+      </w:r>
+      <w:r>
         <w:t xml:space="preserve"> </w:t>
       </w:r>
       <w:r>
-        <w:t xml:space="preserve">με </w:t>
-      </w:r>
-      <w:r>
-        <w:t xml:space="preserve">100%, </w:t>
-      </w:r>
-      <w:r>
-        <w:t xml:space="preserve">μπορεί να μεταβεί σε επόμενη θεωρεία.  </w:t>
-      </w:r>
-    </w:p>
-    <w:p>
-      <w:r>
-        <w:t xml:space="preserve">Ο σκοπός της Ηλεκτρονικής εφαρμογής που αναπτύξαμε από τον ρόλο του μαθητή είναι να είναι κατά την διάρκεια όλου του Μαθήματος </w:t>
-      </w:r>
-      <w:r>
-        <w:rPr>
-          <w:lang w:val="en-US"/>
-        </w:rPr>
-        <w:t>online</w:t>
-      </w:r>
-      <w:r>
-        <w:t xml:space="preserve"> </w:t>
-      </w:r>
-      <w:r>
-        <w:t xml:space="preserve">από την παρουσίαση του καθηγητή μέχρι την ολοκλήρωση του </w:t>
-      </w:r>
-      <w:r>
-        <w:rPr>
-          <w:lang w:val="en-US"/>
-        </w:rPr>
-        <w:t>test</w:t>
-      </w:r>
-      <w:r>
-        <w:t>.</w:t>
-      </w:r>
+        <w:t xml:space="preserve">και να έχει πολλούς καθηγητές με δικό τους προφίλ, δικά ρους μαθήματα και δικούς τους μαθητές πχ. Σε ένα φροντιστήριο </w:t>
+      </w:r>
+    </w:p>
+    <w:p>
+      <w:pPr>
+        <w:pStyle w:val="3"/>
+      </w:pPr>
+      <w:bookmarkStart w:id="12" w:name="_Toc232015401"/>
+      <w:r>
+        <w:t xml:space="preserve">2. 2. 1. </w:t>
+      </w:r>
+      <w:r>
+        <w:t xml:space="preserve">Είσοδος </w:t>
+      </w:r>
+      <w:r>
+        <w:t>καθηγητή</w:t>
+      </w:r>
+      <w:r>
+        <w:t xml:space="preserve"> σ</w:t>
+      </w:r>
+      <w:r>
+        <w:t xml:space="preserve">την </w:t>
+      </w:r>
+      <w:r>
+        <w:t>Εφαρμογή</w:t>
+      </w:r>
+      <w:bookmarkEnd w:id="12"/>
     </w:p>
     <w:p/>
     <w:p>
       <w:pPr>
-        <w:pStyle w:val="2"/>
-      </w:pPr>
-      <w:r>
-        <w:t xml:space="preserve">2. </w:t>
-      </w:r>
-      <w:r>
-        <w:t>2</w:t>
-      </w:r>
-      <w:r>
-        <w:t xml:space="preserve">. Λειτουργίες </w:t>
-      </w:r>
-      <w:r>
-        <w:t>Καθηγητή</w:t>
-      </w:r>
-    </w:p>
-    <w:p/>
-    <w:p>
-      <w:r>
-        <w:t xml:space="preserve">Σε αυτή την ενότητα θα παρουσιάσουμε τις διαθέσιμες λειτουργίες που έχει ο ρόλος του Καθηγητή. Ο συγκεκριμένος ρόλος έχει περισσότερες διαχειρίστηκες λειτουργίες στην εφαρμογή, γιατί η εφαρμογή μπορεί να </w:t>
-      </w:r>
-      <w:proofErr w:type="spellStart"/>
-      <w:r>
-        <w:t>εγκατασταθή</w:t>
-      </w:r>
-      <w:proofErr w:type="spellEnd"/>
-      <w:r>
-        <w:t xml:space="preserve"> σε κάποιο οργανισμό σε κάποιο </w:t>
-      </w:r>
-      <w:r>
-        <w:rPr>
-          <w:lang w:val="en-US"/>
-        </w:rPr>
-        <w:t>server</w:t>
-      </w:r>
-      <w:r>
-        <w:t xml:space="preserve"> </w:t>
-      </w:r>
-      <w:r>
-        <w:t xml:space="preserve">και να έχει πολλούς καθηγητές με δικό τους προφίλ, δικά ρους μαθήματα και δικούς τους μαθητές πχ. Σε ένα φροντιστήριο </w:t>
-      </w:r>
-    </w:p>
-    <w:p>
-      <w:pPr>
-        <w:pStyle w:val="3"/>
-      </w:pPr>
-      <w:r>
-        <w:t xml:space="preserve">2. </w:t>
-      </w:r>
-      <w:r>
-        <w:t>2</w:t>
-      </w:r>
-      <w:r>
-        <w:t xml:space="preserve">. </w:t>
-      </w:r>
-      <w:r>
-        <w:t>1</w:t>
-      </w:r>
-      <w:r>
-        <w:t xml:space="preserve">. </w:t>
-      </w:r>
-      <w:r>
-        <w:t xml:space="preserve">Είσοδος </w:t>
-      </w:r>
-      <w:r>
-        <w:t>καθηγητή</w:t>
-      </w:r>
-      <w:r>
-        <w:t xml:space="preserve"> σ</w:t>
-      </w:r>
-      <w:r>
-        <w:t>τ</w:t>
-      </w:r>
-      <w:r>
-        <w:t>ην</w:t>
-      </w:r>
-      <w:r>
-        <w:t xml:space="preserve"> </w:t>
-      </w:r>
-      <w:r>
-        <w:t>Εφαρμογή</w:t>
-      </w:r>
-    </w:p>
-    <w:p/>
-    <w:p>
-      <w:pPr>
         <w:jc w:val="center"/>
       </w:pPr>
       <w:r>
+        <w:rPr>
+          <w:noProof/>
+        </w:rPr>
         <w:drawing>
           <wp:inline distT="0" distB="0" distL="0" distR="0" wp14:anchorId="084088AF" wp14:editId="21903382">
             <wp:extent cx="3924300" cy="2714625"/>
@@ -4291,7 +4475,351 @@
           <w:i/>
           <w:iCs/>
         </w:rPr>
+        <w:t xml:space="preserve">Εικόνα </w:t>
+      </w:r>
+      <w:r>
+        <w:rPr>
+          <w:i/>
+          <w:iCs/>
+        </w:rPr>
+        <w:t>11</w:t>
+      </w:r>
+    </w:p>
+    <w:p>
+      <w:r>
+        <w:t xml:space="preserve">Στην </w:t>
+      </w:r>
+      <w:r>
+        <w:rPr>
+          <w:i/>
+          <w:iCs/>
+        </w:rPr>
+        <w:t>«εικόνα 11»</w:t>
+      </w:r>
+      <w:r>
+        <w:t xml:space="preserve"> φαίνεται η σελίδα σύνδεσης του καθηγητή στην πλατφόρμα, ο καθηγητής πληκτρολογεί «Όνομα χρήστη» και «Κωδικό» και μπαίνει στο </w:t>
+      </w:r>
+      <w:r>
+        <w:rPr>
+          <w:lang w:val="en-US"/>
+        </w:rPr>
+        <w:t>dashboard</w:t>
+      </w:r>
+      <w:r>
+        <w:t xml:space="preserve"> </w:t>
+      </w:r>
+      <w:r>
+        <w:t>της εφαρμογής.</w:t>
+      </w:r>
+    </w:p>
+    <w:p>
+      <w:r>
+        <w:t xml:space="preserve">Στην επόμενη εικόνα </w:t>
+      </w:r>
+      <w:r>
+        <w:t>«</w:t>
+      </w:r>
+      <w:r>
+        <w:rPr>
+          <w:i/>
+          <w:iCs/>
+        </w:rPr>
+        <w:t xml:space="preserve">εικόνα </w:t>
+      </w:r>
+      <w:r>
+        <w:rPr>
+          <w:i/>
+          <w:iCs/>
+        </w:rPr>
+        <w:t>12</w:t>
+      </w:r>
+      <w:r>
+        <w:rPr>
+          <w:i/>
+          <w:iCs/>
+        </w:rPr>
+        <w:t>»</w:t>
+      </w:r>
+      <w:r>
+        <w:t xml:space="preserve"> βλέπουμε το </w:t>
+      </w:r>
+      <w:r>
+        <w:rPr>
+          <w:lang w:val="en-US"/>
+        </w:rPr>
+        <w:t>dashboard</w:t>
+      </w:r>
+      <w:r>
+        <w:t xml:space="preserve"> </w:t>
+      </w:r>
+      <w:r>
+        <w:t xml:space="preserve">του καθηγητή, σε αυτή την σελίδα έχουμε ένα γενικό </w:t>
+      </w:r>
+      <w:r>
+        <w:rPr>
+          <w:lang w:val="en-US"/>
+        </w:rPr>
+        <w:t>preview</w:t>
+      </w:r>
+      <w:r>
+        <w:t xml:space="preserve"> </w:t>
+      </w:r>
+      <w:r>
+        <w:t xml:space="preserve">για τα περιεχόμενα του </w:t>
+      </w:r>
+      <w:r>
+        <w:rPr>
+          <w:lang w:val="en-US"/>
+        </w:rPr>
+        <w:t>app</w:t>
+      </w:r>
+      <w:r>
+        <w:t xml:space="preserve">. </w:t>
+      </w:r>
+      <w:r>
+        <w:t>Όπως βλέπουμε έχει σε αριθμούς για το πόσα μαθήματα υπάρχουν, για τις ερωτήσεις, τις απαντήσεις, τους μαθητές, τους καθηγητές κτλ.</w:t>
+      </w:r>
+    </w:p>
+    <w:p>
+      <w:r>
+        <w:drawing>
+          <wp:inline distT="0" distB="0" distL="0" distR="0" wp14:anchorId="167C48A5" wp14:editId="0B1E2AF1">
+            <wp:extent cx="6120130" cy="2912745"/>
+            <wp:effectExtent l="0" t="0" r="0" b="1905"/>
+            <wp:docPr id="2007076536" name="Εικόνα 1"/>
+            <wp:cNvGraphicFramePr>
+              <a:graphicFrameLocks xmlns:a="http://schemas.openxmlformats.org/drawingml/2006/main" noChangeAspect="1"/>
+            </wp:cNvGraphicFramePr>
+            <a:graphic xmlns:a="http://schemas.openxmlformats.org/drawingml/2006/main">
+              <a:graphicData uri="http://schemas.openxmlformats.org/drawingml/2006/picture">
+                <pic:pic xmlns:pic="http://schemas.openxmlformats.org/drawingml/2006/picture">
+                  <pic:nvPicPr>
+                    <pic:cNvPr id="2007076536" name=""/>
+                    <pic:cNvPicPr/>
+                  </pic:nvPicPr>
+                  <pic:blipFill>
+                    <a:blip r:embed="rId21"/>
+                    <a:stretch>
+                      <a:fillRect/>
+                    </a:stretch>
+                  </pic:blipFill>
+                  <pic:spPr>
+                    <a:xfrm>
+                      <a:off x="0" y="0"/>
+                      <a:ext cx="6120130" cy="2912745"/>
+                    </a:xfrm>
+                    <a:prstGeom prst="rect">
+                      <a:avLst/>
+                    </a:prstGeom>
+                  </pic:spPr>
+                </pic:pic>
+              </a:graphicData>
+            </a:graphic>
+          </wp:inline>
+        </w:drawing>
+      </w:r>
+    </w:p>
+    <w:p>
+      <w:pPr>
+        <w:jc w:val="center"/>
+        <w:rPr>
+          <w:i/>
+          <w:iCs/>
+        </w:rPr>
+      </w:pPr>
+      <w:r>
+        <w:rPr>
+          <w:i/>
+          <w:iCs/>
+        </w:rPr>
+        <w:t xml:space="preserve">Εικόνα </w:t>
+      </w:r>
+      <w:r>
+        <w:rPr>
+          <w:i/>
+          <w:iCs/>
+        </w:rPr>
+        <w:t>1</w:t>
+      </w:r>
+      <w:r>
+        <w:rPr>
+          <w:i/>
+          <w:iCs/>
+        </w:rPr>
+        <w:t>2</w:t>
+      </w:r>
+    </w:p>
+    <w:p>
+      <w:r>
         <w:lastRenderedPageBreak/>
+        <w:t xml:space="preserve">Επίσης στην ίδια σελίδα μπορεί να δημιουργήσει και λογαριασμό για κάποιο μαθητή, ώστε να </w:t>
+      </w:r>
+      <w:proofErr w:type="spellStart"/>
+      <w:r>
+        <w:t>να</w:t>
+      </w:r>
+      <w:proofErr w:type="spellEnd"/>
+      <w:r>
+        <w:t xml:space="preserve"> έχει </w:t>
+      </w:r>
+      <w:proofErr w:type="spellStart"/>
+      <w:r>
+        <w:t>προσβαση</w:t>
+      </w:r>
+      <w:proofErr w:type="spellEnd"/>
+      <w:r>
+        <w:t xml:space="preserve"> στην εφαρμογή για να παρακολουθήσει κάποιο μάθημα.</w:t>
+      </w:r>
+    </w:p>
+    <w:p>
+      <w:pPr>
+        <w:pStyle w:val="3"/>
+      </w:pPr>
+      <w:bookmarkStart w:id="13" w:name="_Toc232015402"/>
+      <w:r>
+        <w:t xml:space="preserve">2. 2. </w:t>
+      </w:r>
+      <w:r>
+        <w:t>2</w:t>
+      </w:r>
+      <w:r>
+        <w:t xml:space="preserve">. </w:t>
+      </w:r>
+      <w:r>
+        <w:t>Δημιουργία</w:t>
+      </w:r>
+      <w:r>
+        <w:t xml:space="preserve"> και Επεξεργασία </w:t>
+      </w:r>
+      <w:r>
+        <w:t>Καθηγητή</w:t>
+      </w:r>
+      <w:bookmarkEnd w:id="13"/>
+    </w:p>
+    <w:p/>
+    <w:p>
+      <w:pPr>
+        <w:rPr>
+          <w:b/>
+          <w:bCs/>
+        </w:rPr>
+      </w:pPr>
+      <w:r>
+        <w:t xml:space="preserve">Η επόμενη λειτουργία που έχει ο καθηγητής είναι να μπορεί να δημιουργήσει και άλλο λογαριασμό με τα ίδια δικαιώματα ως καθηγητής. Αυτό μπορεί να </w:t>
+      </w:r>
+      <w:r>
+        <w:t>βοηθήσει</w:t>
+      </w:r>
+      <w:r>
+        <w:t xml:space="preserve"> όπως έχουμε </w:t>
+      </w:r>
+      <w:r>
+        <w:t>αναφέρει</w:t>
+      </w:r>
+      <w:r>
+        <w:t xml:space="preserve"> και πιο πάνω αυτό </w:t>
+      </w:r>
+      <w:r>
+        <w:t>βοηθάει</w:t>
+      </w:r>
+      <w:r>
+        <w:t xml:space="preserve"> όταν η εφαρμογή </w:t>
+      </w:r>
+      <w:r>
+        <w:t>εγκατασταθεί</w:t>
+      </w:r>
+      <w:r>
+        <w:t xml:space="preserve"> σε κάποιο οργανισμό όπως ένα </w:t>
+      </w:r>
+      <w:r>
+        <w:t>φροντιστήριο</w:t>
+      </w:r>
+      <w:r>
+        <w:t xml:space="preserve"> με </w:t>
+      </w:r>
+      <w:r>
+        <w:t xml:space="preserve">πολλούς καθηγητές και πολλούς μαθητές </w:t>
+      </w:r>
+      <w:r>
+        <w:t>«</w:t>
+      </w:r>
+      <w:r>
+        <w:rPr>
+          <w:i/>
+          <w:iCs/>
+        </w:rPr>
+        <w:t xml:space="preserve">εικόνα </w:t>
+      </w:r>
+      <w:r>
+        <w:rPr>
+          <w:i/>
+          <w:iCs/>
+        </w:rPr>
+        <w:t>12»</w:t>
+      </w:r>
+      <w:r>
+        <w:rPr>
+          <w:i/>
+          <w:iCs/>
+        </w:rPr>
+        <w:t>.</w:t>
+      </w:r>
+    </w:p>
+    <w:p>
+      <w:r>
+        <w:drawing>
+          <wp:inline distT="0" distB="0" distL="0" distR="0" wp14:anchorId="78EC0AEA" wp14:editId="05D4970C">
+            <wp:extent cx="6120130" cy="2911475"/>
+            <wp:effectExtent l="0" t="0" r="0" b="3175"/>
+            <wp:docPr id="488820587" name="Εικόνα 1"/>
+            <wp:cNvGraphicFramePr>
+              <a:graphicFrameLocks xmlns:a="http://schemas.openxmlformats.org/drawingml/2006/main" noChangeAspect="1"/>
+            </wp:cNvGraphicFramePr>
+            <a:graphic xmlns:a="http://schemas.openxmlformats.org/drawingml/2006/main">
+              <a:graphicData uri="http://schemas.openxmlformats.org/drawingml/2006/picture">
+                <pic:pic xmlns:pic="http://schemas.openxmlformats.org/drawingml/2006/picture">
+                  <pic:nvPicPr>
+                    <pic:cNvPr id="488820587" name=""/>
+                    <pic:cNvPicPr/>
+                  </pic:nvPicPr>
+                  <pic:blipFill>
+                    <a:blip r:embed="rId22"/>
+                    <a:stretch>
+                      <a:fillRect/>
+                    </a:stretch>
+                  </pic:blipFill>
+                  <pic:spPr>
+                    <a:xfrm>
+                      <a:off x="0" y="0"/>
+                      <a:ext cx="6120130" cy="2911475"/>
+                    </a:xfrm>
+                    <a:prstGeom prst="rect">
+                      <a:avLst/>
+                    </a:prstGeom>
+                  </pic:spPr>
+                </pic:pic>
+              </a:graphicData>
+            </a:graphic>
+          </wp:inline>
+        </w:drawing>
+      </w:r>
+      <w:r>
+        <w:t xml:space="preserve">  </w:t>
+      </w:r>
+    </w:p>
+    <w:p>
+      <w:pPr>
+        <w:jc w:val="center"/>
+        <w:rPr>
+          <w:i/>
+          <w:iCs/>
+        </w:rPr>
+      </w:pPr>
+      <w:r>
+        <w:rPr>
+          <w:i/>
+          <w:iCs/>
+        </w:rPr>
         <w:t xml:space="preserve">Εικόνα </w:t>
       </w:r>
       <w:r>
@@ -4306,34 +4834,990 @@
           <w:i/>
           <w:iCs/>
         </w:rPr>
+        <w:t>3</w:t>
+      </w:r>
+    </w:p>
+    <w:p>
+      <w:r>
+        <w:t xml:space="preserve">Στης 2 επόμενες εικόνες φαίνεται η προβολή όλων των καθηγητών </w:t>
+      </w:r>
+      <w:r>
+        <w:rPr>
+          <w:i/>
+          <w:iCs/>
+        </w:rPr>
+        <w:t>«εικόνα 1</w:t>
+      </w:r>
+      <w:r>
+        <w:rPr>
+          <w:i/>
+          <w:iCs/>
+        </w:rPr>
+        <w:t>4</w:t>
+      </w:r>
+      <w:r>
+        <w:rPr>
+          <w:i/>
+          <w:iCs/>
+        </w:rPr>
+        <w:t>»</w:t>
+      </w:r>
+      <w:r>
+        <w:t xml:space="preserve"> </w:t>
+      </w:r>
+      <w:r>
+        <w:t xml:space="preserve"> και η επεξεργασία στο προφίλ </w:t>
+      </w:r>
+      <w:proofErr w:type="spellStart"/>
+      <w:r>
+        <w:t>ένος</w:t>
+      </w:r>
+      <w:proofErr w:type="spellEnd"/>
+      <w:r>
+        <w:t xml:space="preserve"> καθηγητή </w:t>
+      </w:r>
+      <w:r>
+        <w:rPr>
+          <w:i/>
+          <w:iCs/>
+        </w:rPr>
+        <w:t>«εικόνα 1</w:t>
+      </w:r>
+      <w:r>
+        <w:rPr>
+          <w:i/>
+          <w:iCs/>
+        </w:rPr>
+        <w:t>5</w:t>
+      </w:r>
+      <w:r>
+        <w:rPr>
+          <w:i/>
+          <w:iCs/>
+        </w:rPr>
+        <w:t>»</w:t>
+      </w:r>
+      <w:r>
+        <w:t xml:space="preserve"> </w:t>
+      </w:r>
+      <w:r>
+        <w:t xml:space="preserve">  </w:t>
+      </w:r>
+    </w:p>
+    <w:p>
+      <w:r>
+        <w:drawing>
+          <wp:inline distT="0" distB="0" distL="0" distR="0" wp14:anchorId="0D82A53F" wp14:editId="1AE4D521">
+            <wp:extent cx="6120130" cy="2911475"/>
+            <wp:effectExtent l="0" t="0" r="0" b="3175"/>
+            <wp:docPr id="720301194" name="Εικόνα 1"/>
+            <wp:cNvGraphicFramePr>
+              <a:graphicFrameLocks xmlns:a="http://schemas.openxmlformats.org/drawingml/2006/main" noChangeAspect="1"/>
+            </wp:cNvGraphicFramePr>
+            <a:graphic xmlns:a="http://schemas.openxmlformats.org/drawingml/2006/main">
+              <a:graphicData uri="http://schemas.openxmlformats.org/drawingml/2006/picture">
+                <pic:pic xmlns:pic="http://schemas.openxmlformats.org/drawingml/2006/picture">
+                  <pic:nvPicPr>
+                    <pic:cNvPr id="720301194" name=""/>
+                    <pic:cNvPicPr/>
+                  </pic:nvPicPr>
+                  <pic:blipFill>
+                    <a:blip r:embed="rId23"/>
+                    <a:stretch>
+                      <a:fillRect/>
+                    </a:stretch>
+                  </pic:blipFill>
+                  <pic:spPr>
+                    <a:xfrm>
+                      <a:off x="0" y="0"/>
+                      <a:ext cx="6120130" cy="2911475"/>
+                    </a:xfrm>
+                    <a:prstGeom prst="rect">
+                      <a:avLst/>
+                    </a:prstGeom>
+                  </pic:spPr>
+                </pic:pic>
+              </a:graphicData>
+            </a:graphic>
+          </wp:inline>
+        </w:drawing>
+      </w:r>
+    </w:p>
+    <w:p>
+      <w:pPr>
+        <w:jc w:val="center"/>
+        <w:rPr>
+          <w:i/>
+          <w:iCs/>
+        </w:rPr>
+      </w:pPr>
+      <w:r>
+        <w:rPr>
+          <w:i/>
+          <w:iCs/>
+        </w:rPr>
+        <w:t xml:space="preserve">Εικόνα </w:t>
+      </w:r>
+      <w:r>
+        <w:rPr>
+          <w:i/>
+          <w:iCs/>
+        </w:rPr>
         <w:t>1</w:t>
       </w:r>
-    </w:p>
-    <w:p>
-      <w:r>
-        <w:t xml:space="preserve">Στην «εικόνα 11» φαίνεται η σελίδα σύνδεσης του καθηγητή στην πλατφόρμα, ο καθηγητής πληκτρολογεί «Όνομα χρήστη» και «Κωδικό» και μπαίνει στο </w:t>
+      <w:r>
+        <w:rPr>
+          <w:i/>
+          <w:iCs/>
+        </w:rPr>
+        <w:t>4</w:t>
+      </w:r>
+    </w:p>
+    <w:p>
+      <w:r>
+        <w:lastRenderedPageBreak/>
+        <w:drawing>
+          <wp:inline distT="0" distB="0" distL="0" distR="0" wp14:anchorId="7019D0CC" wp14:editId="0A11C774">
+            <wp:extent cx="6120130" cy="2903220"/>
+            <wp:effectExtent l="0" t="0" r="0" b="0"/>
+            <wp:docPr id="1874540902" name="Εικόνα 1"/>
+            <wp:cNvGraphicFramePr>
+              <a:graphicFrameLocks xmlns:a="http://schemas.openxmlformats.org/drawingml/2006/main" noChangeAspect="1"/>
+            </wp:cNvGraphicFramePr>
+            <a:graphic xmlns:a="http://schemas.openxmlformats.org/drawingml/2006/main">
+              <a:graphicData uri="http://schemas.openxmlformats.org/drawingml/2006/picture">
+                <pic:pic xmlns:pic="http://schemas.openxmlformats.org/drawingml/2006/picture">
+                  <pic:nvPicPr>
+                    <pic:cNvPr id="1874540902" name=""/>
+                    <pic:cNvPicPr/>
+                  </pic:nvPicPr>
+                  <pic:blipFill>
+                    <a:blip r:embed="rId24"/>
+                    <a:stretch>
+                      <a:fillRect/>
+                    </a:stretch>
+                  </pic:blipFill>
+                  <pic:spPr>
+                    <a:xfrm>
+                      <a:off x="0" y="0"/>
+                      <a:ext cx="6120130" cy="2903220"/>
+                    </a:xfrm>
+                    <a:prstGeom prst="rect">
+                      <a:avLst/>
+                    </a:prstGeom>
+                  </pic:spPr>
+                </pic:pic>
+              </a:graphicData>
+            </a:graphic>
+          </wp:inline>
+        </w:drawing>
+      </w:r>
+    </w:p>
+    <w:p>
+      <w:pPr>
+        <w:jc w:val="center"/>
+        <w:rPr>
+          <w:i/>
+          <w:iCs/>
+        </w:rPr>
+      </w:pPr>
+      <w:r>
+        <w:rPr>
+          <w:i/>
+          <w:iCs/>
+        </w:rPr>
+        <w:t xml:space="preserve">Εικόνα </w:t>
+      </w:r>
+      <w:r>
+        <w:rPr>
+          <w:i/>
+          <w:iCs/>
+        </w:rPr>
+        <w:t>1</w:t>
+      </w:r>
+      <w:r>
+        <w:rPr>
+          <w:i/>
+          <w:iCs/>
+        </w:rPr>
+        <w:t>5</w:t>
+      </w:r>
+    </w:p>
+    <w:p>
+      <w:r>
+        <w:t xml:space="preserve">Ακόμα έχει την δυνατότητα για </w:t>
       </w:r>
       <w:r>
         <w:rPr>
           <w:lang w:val="en-US"/>
         </w:rPr>
-        <w:t>dashboard</w:t>
+        <w:t>reset</w:t>
       </w:r>
       <w:r>
         <w:t xml:space="preserve"> </w:t>
       </w:r>
       <w:r>
-        <w:t>της εφαρμογής.</w:t>
-      </w:r>
-    </w:p>
-    <w:p>
-      <w:r>
-        <w:t xml:space="preserve">     </w:t>
-      </w:r>
-    </w:p>
+        <w:rPr>
+          <w:lang w:val="en-US"/>
+        </w:rPr>
+        <w:t>password</w:t>
+      </w:r>
+      <w:r>
+        <w:t xml:space="preserve"> </w:t>
+      </w:r>
+      <w:r>
+        <w:t xml:space="preserve">και </w:t>
+      </w:r>
+      <w:r>
+        <w:rPr>
+          <w:lang w:val="en-US"/>
+        </w:rPr>
+        <w:t>delete</w:t>
+      </w:r>
+      <w:r>
+        <w:t xml:space="preserve"> </w:t>
+      </w:r>
+      <w:r>
+        <w:t>του καθηγητή.</w:t>
+      </w:r>
+    </w:p>
+    <w:p>
+      <w:pPr>
+        <w:pStyle w:val="3"/>
+      </w:pPr>
+      <w:bookmarkStart w:id="14" w:name="_Toc232015403"/>
+      <w:r>
+        <w:t xml:space="preserve">2. 2. </w:t>
+      </w:r>
+      <w:r>
+        <w:t>3</w:t>
+      </w:r>
+      <w:r>
+        <w:t xml:space="preserve">. Δημιουργία και Επεξεργασία </w:t>
+      </w:r>
+      <w:r>
+        <w:t>Μαθητή</w:t>
+      </w:r>
+      <w:bookmarkEnd w:id="14"/>
+    </w:p>
+    <w:p/>
+    <w:p>
+      <w:r>
+        <w:t>Μια ακόμα λειτουργία που έχει ο καθηγητής είναι η δημιουργία μαθητή, η επεξεργασία και η διαγραφή από την εφαρμογή.</w:t>
+      </w:r>
+    </w:p>
+    <w:p>
+      <w:r>
+        <w:drawing>
+          <wp:inline distT="0" distB="0" distL="0" distR="0" wp14:anchorId="10D7ECC2" wp14:editId="600019FE">
+            <wp:extent cx="6120130" cy="2863850"/>
+            <wp:effectExtent l="0" t="0" r="0" b="0"/>
+            <wp:docPr id="957369488" name="Εικόνα 1"/>
+            <wp:cNvGraphicFramePr>
+              <a:graphicFrameLocks xmlns:a="http://schemas.openxmlformats.org/drawingml/2006/main" noChangeAspect="1"/>
+            </wp:cNvGraphicFramePr>
+            <a:graphic xmlns:a="http://schemas.openxmlformats.org/drawingml/2006/main">
+              <a:graphicData uri="http://schemas.openxmlformats.org/drawingml/2006/picture">
+                <pic:pic xmlns:pic="http://schemas.openxmlformats.org/drawingml/2006/picture">
+                  <pic:nvPicPr>
+                    <pic:cNvPr id="957369488" name=""/>
+                    <pic:cNvPicPr/>
+                  </pic:nvPicPr>
+                  <pic:blipFill>
+                    <a:blip r:embed="rId25"/>
+                    <a:stretch>
+                      <a:fillRect/>
+                    </a:stretch>
+                  </pic:blipFill>
+                  <pic:spPr>
+                    <a:xfrm>
+                      <a:off x="0" y="0"/>
+                      <a:ext cx="6120130" cy="2863850"/>
+                    </a:xfrm>
+                    <a:prstGeom prst="rect">
+                      <a:avLst/>
+                    </a:prstGeom>
+                  </pic:spPr>
+                </pic:pic>
+              </a:graphicData>
+            </a:graphic>
+          </wp:inline>
+        </w:drawing>
+      </w:r>
+      <w:r>
+        <w:t xml:space="preserve"> </w:t>
+      </w:r>
+    </w:p>
+    <w:p>
+      <w:pPr>
+        <w:jc w:val="center"/>
+        <w:rPr>
+          <w:i/>
+          <w:iCs/>
+        </w:rPr>
+      </w:pPr>
+      <w:r>
+        <w:rPr>
+          <w:i/>
+          <w:iCs/>
+        </w:rPr>
+        <w:t xml:space="preserve">Εικόνα </w:t>
+      </w:r>
+      <w:r>
+        <w:rPr>
+          <w:i/>
+          <w:iCs/>
+        </w:rPr>
+        <w:t>1</w:t>
+      </w:r>
+      <w:r>
+        <w:rPr>
+          <w:i/>
+          <w:iCs/>
+        </w:rPr>
+        <w:t>6</w:t>
+      </w:r>
+    </w:p>
+    <w:p>
+      <w:r>
+        <w:t>Στην πιο πάνω εικόνα</w:t>
+      </w:r>
+      <w:r>
+        <w:t xml:space="preserve"> </w:t>
+      </w:r>
+      <w:r>
+        <w:rPr>
+          <w:i/>
+          <w:iCs/>
+        </w:rPr>
+        <w:t>«εικόνα 1</w:t>
+      </w:r>
+      <w:r>
+        <w:rPr>
+          <w:i/>
+          <w:iCs/>
+        </w:rPr>
+        <w:t>6</w:t>
+      </w:r>
+      <w:r>
+        <w:rPr>
+          <w:i/>
+          <w:iCs/>
+        </w:rPr>
+        <w:t>»</w:t>
+      </w:r>
+      <w:r>
+        <w:t xml:space="preserve"> </w:t>
+      </w:r>
+      <w:r>
+        <w:t>βλέπουμε</w:t>
+      </w:r>
+      <w:r>
+        <w:t xml:space="preserve"> την δημιουργία ενός μαθητή </w:t>
+      </w:r>
+      <w:r>
+        <w:t xml:space="preserve">με πεδία όπως όνομα, επώνυμο, </w:t>
+      </w:r>
+      <w:r>
+        <w:rPr>
+          <w:lang w:val="en-US"/>
+        </w:rPr>
+        <w:t>email</w:t>
+      </w:r>
+      <w:r>
+        <w:t xml:space="preserve">, κωδικός κτλ. Επίσης έχουμε βάλει και κάποιες άλλες πληροφορίες όπως τηλέφωνο, διεύθυνσή κτλ. Το πιο σημαντικό είναι η ενότητα που γράφει Πρόσβαση σε Ενότητα, σε αυτή την ενότητα μπορεί ο καθηγητής να επιλέξει πια ενότητα θα παρακολουθήσει ο μαθητής. </w:t>
+      </w:r>
+    </w:p>
+    <w:p>
+      <w:r>
+        <w:t xml:space="preserve">Στις επόμενες εικόνες φαίνεται η επεξεργασία του προφίλ </w:t>
+      </w:r>
+      <w:r>
+        <w:rPr>
+          <w:i/>
+          <w:iCs/>
+        </w:rPr>
+        <w:t>«εικόνα 1</w:t>
+      </w:r>
+      <w:r>
+        <w:rPr>
+          <w:i/>
+          <w:iCs/>
+        </w:rPr>
+        <w:t>7</w:t>
+      </w:r>
+      <w:r>
+        <w:rPr>
+          <w:i/>
+          <w:iCs/>
+        </w:rPr>
+        <w:t>»</w:t>
+      </w:r>
+      <w:r>
+        <w:t xml:space="preserve"> του μαθητή και οι προβολή όλων </w:t>
+      </w:r>
+      <w:r>
+        <w:rPr>
+          <w:i/>
+          <w:iCs/>
+        </w:rPr>
+        <w:t>«εικόνα 1</w:t>
+      </w:r>
+      <w:r>
+        <w:rPr>
+          <w:i/>
+          <w:iCs/>
+        </w:rPr>
+        <w:t>8</w:t>
+      </w:r>
+      <w:r>
+        <w:rPr>
+          <w:i/>
+          <w:iCs/>
+        </w:rPr>
+        <w:t>»</w:t>
+      </w:r>
+      <w:r>
+        <w:t>.</w:t>
+      </w:r>
+    </w:p>
+    <w:p>
+      <w:r>
+        <w:lastRenderedPageBreak/>
+        <w:drawing>
+          <wp:inline distT="0" distB="0" distL="0" distR="0" wp14:anchorId="3934A545" wp14:editId="25E7BA50">
+            <wp:extent cx="6120130" cy="2914015"/>
+            <wp:effectExtent l="0" t="0" r="0" b="635"/>
+            <wp:docPr id="344258256" name="Εικόνα 1"/>
+            <wp:cNvGraphicFramePr>
+              <a:graphicFrameLocks xmlns:a="http://schemas.openxmlformats.org/drawingml/2006/main" noChangeAspect="1"/>
+            </wp:cNvGraphicFramePr>
+            <a:graphic xmlns:a="http://schemas.openxmlformats.org/drawingml/2006/main">
+              <a:graphicData uri="http://schemas.openxmlformats.org/drawingml/2006/picture">
+                <pic:pic xmlns:pic="http://schemas.openxmlformats.org/drawingml/2006/picture">
+                  <pic:nvPicPr>
+                    <pic:cNvPr id="344258256" name=""/>
+                    <pic:cNvPicPr/>
+                  </pic:nvPicPr>
+                  <pic:blipFill>
+                    <a:blip r:embed="rId26"/>
+                    <a:stretch>
+                      <a:fillRect/>
+                    </a:stretch>
+                  </pic:blipFill>
+                  <pic:spPr>
+                    <a:xfrm>
+                      <a:off x="0" y="0"/>
+                      <a:ext cx="6120130" cy="2914015"/>
+                    </a:xfrm>
+                    <a:prstGeom prst="rect">
+                      <a:avLst/>
+                    </a:prstGeom>
+                  </pic:spPr>
+                </pic:pic>
+              </a:graphicData>
+            </a:graphic>
+          </wp:inline>
+        </w:drawing>
+      </w:r>
+    </w:p>
+    <w:p>
+      <w:pPr>
+        <w:jc w:val="center"/>
+        <w:rPr>
+          <w:i/>
+          <w:iCs/>
+        </w:rPr>
+      </w:pPr>
+      <w:r>
+        <w:rPr>
+          <w:i/>
+          <w:iCs/>
+        </w:rPr>
+        <w:t xml:space="preserve">Εικόνα </w:t>
+      </w:r>
+      <w:r>
+        <w:rPr>
+          <w:i/>
+          <w:iCs/>
+        </w:rPr>
+        <w:t>1</w:t>
+      </w:r>
+      <w:r>
+        <w:rPr>
+          <w:i/>
+          <w:iCs/>
+        </w:rPr>
+        <w:t>7</w:t>
+      </w:r>
+    </w:p>
+    <w:p/>
+    <w:p>
+      <w:r>
+        <w:drawing>
+          <wp:inline distT="0" distB="0" distL="0" distR="0" wp14:anchorId="282FC67F" wp14:editId="18B5A6D6">
+            <wp:extent cx="6120130" cy="2919095"/>
+            <wp:effectExtent l="0" t="0" r="0" b="0"/>
+            <wp:docPr id="1746811274" name="Εικόνα 1"/>
+            <wp:cNvGraphicFramePr>
+              <a:graphicFrameLocks xmlns:a="http://schemas.openxmlformats.org/drawingml/2006/main" noChangeAspect="1"/>
+            </wp:cNvGraphicFramePr>
+            <a:graphic xmlns:a="http://schemas.openxmlformats.org/drawingml/2006/main">
+              <a:graphicData uri="http://schemas.openxmlformats.org/drawingml/2006/picture">
+                <pic:pic xmlns:pic="http://schemas.openxmlformats.org/drawingml/2006/picture">
+                  <pic:nvPicPr>
+                    <pic:cNvPr id="1746811274" name=""/>
+                    <pic:cNvPicPr/>
+                  </pic:nvPicPr>
+                  <pic:blipFill>
+                    <a:blip r:embed="rId27"/>
+                    <a:stretch>
+                      <a:fillRect/>
+                    </a:stretch>
+                  </pic:blipFill>
+                  <pic:spPr>
+                    <a:xfrm>
+                      <a:off x="0" y="0"/>
+                      <a:ext cx="6120130" cy="2919095"/>
+                    </a:xfrm>
+                    <a:prstGeom prst="rect">
+                      <a:avLst/>
+                    </a:prstGeom>
+                  </pic:spPr>
+                </pic:pic>
+              </a:graphicData>
+            </a:graphic>
+          </wp:inline>
+        </w:drawing>
+      </w:r>
+      <w:r>
+        <w:t xml:space="preserve">   </w:t>
+      </w:r>
+    </w:p>
+    <w:p>
+      <w:pPr>
+        <w:jc w:val="center"/>
+        <w:rPr>
+          <w:i/>
+          <w:iCs/>
+        </w:rPr>
+      </w:pPr>
+      <w:r>
+        <w:rPr>
+          <w:i/>
+          <w:iCs/>
+        </w:rPr>
+        <w:t xml:space="preserve">Εικόνα </w:t>
+      </w:r>
+      <w:r>
+        <w:rPr>
+          <w:i/>
+          <w:iCs/>
+        </w:rPr>
+        <w:t>1</w:t>
+      </w:r>
+      <w:r>
+        <w:rPr>
+          <w:i/>
+          <w:iCs/>
+        </w:rPr>
+        <w:t>8</w:t>
+      </w:r>
+    </w:p>
+    <w:p>
+      <w:r>
+        <w:t xml:space="preserve">Όπως και στην ενότητα των καθηγητών έτσι και στην ενότητα των μαθητών, μπορεί να γίνει </w:t>
+      </w:r>
+      <w:r>
+        <w:rPr>
+          <w:lang w:val="en-US"/>
+        </w:rPr>
+        <w:t>reset</w:t>
+      </w:r>
+      <w:r>
+        <w:t xml:space="preserve"> </w:t>
+      </w:r>
+      <w:r>
+        <w:t>ο κωδικός και η διαγραφή του λογαριασμού του μαθητή.</w:t>
+      </w:r>
+    </w:p>
+    <w:p>
+      <w:pPr>
+        <w:pStyle w:val="3"/>
+      </w:pPr>
+      <w:bookmarkStart w:id="15" w:name="_Toc232015404"/>
+      <w:r>
+        <w:t xml:space="preserve">2. 2. </w:t>
+      </w:r>
+      <w:r>
+        <w:t>4</w:t>
+      </w:r>
+      <w:r>
+        <w:t xml:space="preserve">. Δημιουργία και Επεξεργασία </w:t>
+      </w:r>
+      <w:r>
+        <w:t>Ενότητας</w:t>
+      </w:r>
+      <w:bookmarkEnd w:id="15"/>
+    </w:p>
+    <w:p/>
+    <w:p>
+      <w:r>
+        <w:t xml:space="preserve">Σε αυτή την παραγραφώ θα δούμε λειτουργία για τις Θεματικές Ενότητες, αυτή η λειτουργία κάνει πιο ελκυστική την εφαρμογή μας, γιατί δεν περιορίζεται σε μία ενότητα πχ Μαθήματα β’ γυμνασίου, αλλά μπορεί να </w:t>
+      </w:r>
+      <w:proofErr w:type="spellStart"/>
+      <w:r>
+        <w:t>προσαρμοστή</w:t>
+      </w:r>
+      <w:proofErr w:type="spellEnd"/>
+      <w:r>
+        <w:t xml:space="preserve"> σε οπουδήποτε θεματολογία για εξέταση πχ Μαθήματα για Πανεπιστήμιο , η Μαθήματα Πληροφορικής κτλ.</w:t>
+      </w:r>
+    </w:p>
+    <w:p>
+      <w:pPr>
+        <w:rPr>
+          <w:i/>
+          <w:iCs/>
+        </w:rPr>
+      </w:pPr>
+      <w:r>
+        <w:t xml:space="preserve">Στην εικόνα πιο κάτω βλέπουμε την δημιουργία μίας θεματικής ενότητας </w:t>
+      </w:r>
+      <w:r>
+        <w:rPr>
+          <w:i/>
+          <w:iCs/>
+        </w:rPr>
+        <w:t>«εικόνα 1</w:t>
+      </w:r>
+      <w:r>
+        <w:rPr>
+          <w:i/>
+          <w:iCs/>
+        </w:rPr>
+        <w:t>9</w:t>
+      </w:r>
+      <w:r>
+        <w:rPr>
+          <w:i/>
+          <w:iCs/>
+        </w:rPr>
+        <w:t>»</w:t>
+      </w:r>
+      <w:r>
+        <w:rPr>
+          <w:i/>
+          <w:iCs/>
+        </w:rPr>
+        <w:t>.</w:t>
+      </w:r>
+    </w:p>
+    <w:p>
+      <w:r>
+        <w:lastRenderedPageBreak/>
+        <w:drawing>
+          <wp:inline distT="0" distB="0" distL="0" distR="0" wp14:anchorId="2B1F02B9" wp14:editId="6A0F663A">
+            <wp:extent cx="6120130" cy="2905125"/>
+            <wp:effectExtent l="0" t="0" r="0" b="9525"/>
+            <wp:docPr id="2088712977" name="Εικόνα 1"/>
+            <wp:cNvGraphicFramePr>
+              <a:graphicFrameLocks xmlns:a="http://schemas.openxmlformats.org/drawingml/2006/main" noChangeAspect="1"/>
+            </wp:cNvGraphicFramePr>
+            <a:graphic xmlns:a="http://schemas.openxmlformats.org/drawingml/2006/main">
+              <a:graphicData uri="http://schemas.openxmlformats.org/drawingml/2006/picture">
+                <pic:pic xmlns:pic="http://schemas.openxmlformats.org/drawingml/2006/picture">
+                  <pic:nvPicPr>
+                    <pic:cNvPr id="2088712977" name=""/>
+                    <pic:cNvPicPr/>
+                  </pic:nvPicPr>
+                  <pic:blipFill>
+                    <a:blip r:embed="rId28"/>
+                    <a:stretch>
+                      <a:fillRect/>
+                    </a:stretch>
+                  </pic:blipFill>
+                  <pic:spPr>
+                    <a:xfrm>
+                      <a:off x="0" y="0"/>
+                      <a:ext cx="6120130" cy="2905125"/>
+                    </a:xfrm>
+                    <a:prstGeom prst="rect">
+                      <a:avLst/>
+                    </a:prstGeom>
+                  </pic:spPr>
+                </pic:pic>
+              </a:graphicData>
+            </a:graphic>
+          </wp:inline>
+        </w:drawing>
+      </w:r>
+    </w:p>
+    <w:p>
+      <w:pPr>
+        <w:jc w:val="center"/>
+        <w:rPr>
+          <w:i/>
+          <w:iCs/>
+        </w:rPr>
+      </w:pPr>
+      <w:r>
+        <w:rPr>
+          <w:i/>
+          <w:iCs/>
+        </w:rPr>
+        <w:t xml:space="preserve">Εικόνα </w:t>
+      </w:r>
+      <w:r>
+        <w:rPr>
+          <w:i/>
+          <w:iCs/>
+        </w:rPr>
+        <w:t>1</w:t>
+      </w:r>
+      <w:r>
+        <w:rPr>
+          <w:i/>
+          <w:iCs/>
+        </w:rPr>
+        <w:t>9</w:t>
+      </w:r>
+    </w:p>
+    <w:p>
+      <w:r>
+        <w:t>Όπως βλέπουμε πιο πάνω έχει πεδία τον τίτλο, μία σύντομή περιγραφή, μία περιγραφή και την εικόνα που συνοδεύει το μάθημα.</w:t>
+      </w:r>
+    </w:p>
+    <w:p>
+      <w:r>
+        <w:t xml:space="preserve">Οι επόμενες εικόνες είναι η επεξεργασία </w:t>
+      </w:r>
+      <w:r>
+        <w:rPr>
+          <w:i/>
+          <w:iCs/>
+        </w:rPr>
+        <w:t xml:space="preserve">«εικόνα </w:t>
+      </w:r>
+      <w:r>
+        <w:rPr>
+          <w:i/>
+          <w:iCs/>
+        </w:rPr>
+        <w:t>20</w:t>
+      </w:r>
+      <w:r>
+        <w:rPr>
+          <w:i/>
+          <w:iCs/>
+        </w:rPr>
+        <w:t>»</w:t>
+      </w:r>
+      <w:r>
+        <w:t xml:space="preserve"> και προβολή όλων των θεματικών ενοτήτων </w:t>
+      </w:r>
+      <w:r>
+        <w:rPr>
+          <w:i/>
+          <w:iCs/>
+        </w:rPr>
+        <w:t xml:space="preserve">«εικόνα </w:t>
+      </w:r>
+      <w:r>
+        <w:rPr>
+          <w:i/>
+          <w:iCs/>
+        </w:rPr>
+        <w:t>2</w:t>
+      </w:r>
+      <w:r>
+        <w:rPr>
+          <w:i/>
+          <w:iCs/>
+        </w:rPr>
+        <w:t>1</w:t>
+      </w:r>
+      <w:r>
+        <w:rPr>
+          <w:i/>
+          <w:iCs/>
+        </w:rPr>
+        <w:t>»</w:t>
+      </w:r>
+      <w:r>
+        <w:t>.</w:t>
+      </w:r>
+    </w:p>
+    <w:p/>
+    <w:p>
+      <w:pPr>
+        <w:jc w:val="center"/>
+        <w:rPr>
+          <w:i/>
+          <w:iCs/>
+        </w:rPr>
+      </w:pPr>
+      <w:r>
+        <w:drawing>
+          <wp:inline distT="0" distB="0" distL="0" distR="0" wp14:anchorId="3084045D" wp14:editId="581FF1DC">
+            <wp:extent cx="6120130" cy="2908300"/>
+            <wp:effectExtent l="0" t="0" r="0" b="6350"/>
+            <wp:docPr id="2106096569" name="Εικόνα 1"/>
+            <wp:cNvGraphicFramePr>
+              <a:graphicFrameLocks xmlns:a="http://schemas.openxmlformats.org/drawingml/2006/main" noChangeAspect="1"/>
+            </wp:cNvGraphicFramePr>
+            <a:graphic xmlns:a="http://schemas.openxmlformats.org/drawingml/2006/main">
+              <a:graphicData uri="http://schemas.openxmlformats.org/drawingml/2006/picture">
+                <pic:pic xmlns:pic="http://schemas.openxmlformats.org/drawingml/2006/picture">
+                  <pic:nvPicPr>
+                    <pic:cNvPr id="2106096569" name=""/>
+                    <pic:cNvPicPr/>
+                  </pic:nvPicPr>
+                  <pic:blipFill>
+                    <a:blip r:embed="rId29"/>
+                    <a:stretch>
+                      <a:fillRect/>
+                    </a:stretch>
+                  </pic:blipFill>
+                  <pic:spPr>
+                    <a:xfrm>
+                      <a:off x="0" y="0"/>
+                      <a:ext cx="6120130" cy="2908300"/>
+                    </a:xfrm>
+                    <a:prstGeom prst="rect">
+                      <a:avLst/>
+                    </a:prstGeom>
+                  </pic:spPr>
+                </pic:pic>
+              </a:graphicData>
+            </a:graphic>
+          </wp:inline>
+        </w:drawing>
+      </w:r>
+    </w:p>
+    <w:p>
+      <w:pPr>
+        <w:jc w:val="center"/>
+        <w:rPr>
+          <w:i/>
+          <w:iCs/>
+        </w:rPr>
+      </w:pPr>
+      <w:r>
+        <w:rPr>
+          <w:i/>
+          <w:iCs/>
+        </w:rPr>
+        <w:t xml:space="preserve">Εικόνα </w:t>
+      </w:r>
+      <w:r>
+        <w:rPr>
+          <w:i/>
+          <w:iCs/>
+        </w:rPr>
+        <w:t>20</w:t>
+      </w:r>
+    </w:p>
+    <w:p>
+      <w:pPr>
+        <w:jc w:val="center"/>
+        <w:rPr>
+          <w:i/>
+          <w:iCs/>
+        </w:rPr>
+      </w:pPr>
+      <w:r>
+        <w:lastRenderedPageBreak/>
+        <w:drawing>
+          <wp:inline distT="0" distB="0" distL="0" distR="0" wp14:anchorId="550537C9" wp14:editId="34252A6F">
+            <wp:extent cx="6120130" cy="2912745"/>
+            <wp:effectExtent l="0" t="0" r="0" b="1905"/>
+            <wp:docPr id="301789071" name="Εικόνα 1"/>
+            <wp:cNvGraphicFramePr>
+              <a:graphicFrameLocks xmlns:a="http://schemas.openxmlformats.org/drawingml/2006/main" noChangeAspect="1"/>
+            </wp:cNvGraphicFramePr>
+            <a:graphic xmlns:a="http://schemas.openxmlformats.org/drawingml/2006/main">
+              <a:graphicData uri="http://schemas.openxmlformats.org/drawingml/2006/picture">
+                <pic:pic xmlns:pic="http://schemas.openxmlformats.org/drawingml/2006/picture">
+                  <pic:nvPicPr>
+                    <pic:cNvPr id="301789071" name=""/>
+                    <pic:cNvPicPr/>
+                  </pic:nvPicPr>
+                  <pic:blipFill>
+                    <a:blip r:embed="rId30"/>
+                    <a:stretch>
+                      <a:fillRect/>
+                    </a:stretch>
+                  </pic:blipFill>
+                  <pic:spPr>
+                    <a:xfrm>
+                      <a:off x="0" y="0"/>
+                      <a:ext cx="6120130" cy="2912745"/>
+                    </a:xfrm>
+                    <a:prstGeom prst="rect">
+                      <a:avLst/>
+                    </a:prstGeom>
+                  </pic:spPr>
+                </pic:pic>
+              </a:graphicData>
+            </a:graphic>
+          </wp:inline>
+        </w:drawing>
+      </w:r>
+    </w:p>
+    <w:p>
+      <w:pPr>
+        <w:jc w:val="center"/>
+        <w:rPr>
+          <w:i/>
+          <w:iCs/>
+        </w:rPr>
+      </w:pPr>
+      <w:r>
+        <w:rPr>
+          <w:i/>
+          <w:iCs/>
+        </w:rPr>
+        <w:t xml:space="preserve">Εικόνα </w:t>
+      </w:r>
+      <w:r>
+        <w:rPr>
+          <w:i/>
+          <w:iCs/>
+        </w:rPr>
+        <w:t>2</w:t>
+      </w:r>
+      <w:r>
+        <w:rPr>
+          <w:i/>
+          <w:iCs/>
+        </w:rPr>
+        <w:t>1</w:t>
+      </w:r>
+    </w:p>
+    <w:p>
+      <w:pPr>
+        <w:pStyle w:val="3"/>
+      </w:pPr>
+      <w:bookmarkStart w:id="16" w:name="_Toc232015405"/>
+      <w:r>
+        <w:t xml:space="preserve">2. 2. </w:t>
+      </w:r>
+      <w:r>
+        <w:t>5</w:t>
+      </w:r>
+      <w:r>
+        <w:t xml:space="preserve">. Δημιουργία και Επεξεργασία </w:t>
+      </w:r>
+      <w:r>
+        <w:t>Μαθημάτων</w:t>
+      </w:r>
+      <w:bookmarkEnd w:id="16"/>
+    </w:p>
+    <w:p/>
     <w:p/>
     <w:sectPr>
-      <w:footerReference w:type="default" r:id="rId21"/>
+      <w:footerReference w:type="default" r:id="rId31"/>
       <w:pgSz w:w="11906" w:h="16838"/>
       <w:pgMar w:top="1134" w:right="1134" w:bottom="1134" w:left="1134" w:header="709" w:footer="709" w:gutter="0"/>
       <w:cols w:space="708"/>
@@ -6583,6 +8067,7 @@
   <w:style w:type="character" w:default="1" w:styleId="a0">
     <w:name w:val="Default Paragraph Font"/>
     <w:uiPriority w:val="1"/>
+    <w:semiHidden/>
     <w:unhideWhenUsed/>
   </w:style>
   <w:style w:type="table" w:default="1" w:styleId="a1">

</xml_diff>